<commit_message>
feat: dica "revelar letra" na partida (RN20)
- Ate 3 dicas por partida; a dica revela a primeira casa VAZIA da palavra
  selecionada (ou a primeira nao revelada), sem nunca indicar se o que o
  aluno digitou esta certo
- Cada letra revelada tira 20% dos pontos de cada palavra que passa pela
  casa (cruzamento desconta das duas); limite e custo em regras.js (DICAS)
- Nova tabela dica_sessao (UNIQUE por casa); rota POST /sessoes/:id/dica
- Tela de jogo: botao com contador, letra revelada travada em amarelo,
  desconto no resultado; coluna Dicas no ranking e nas partidas
- Testes: dica.test.js (escolha da casa, cruzamentos, desconto)
- Docs: RN20, casos de uso, API, dicionario de dados, CRUD, rastreabilidade,
  decisoes D17-D19, manuais (.md e .docx) com novas capturas

Co-Authored-By: Claude Opus 5.5 (1M context) <noreply@anthropic.com>
</commit_message>
<xml_diff>
--- a/docs/manuais/Manual do Desenvolvedor - Cruzadinha Digital.docx
+++ b/docs/manuais/Manual do Desenvolvedor - Cruzadinha Digital.docx
@@ -132,7 +132,7 @@
         <w:t>Versão do documento:</w:t>
       </w:r>
       <w:r>
-        <w:t xml:space="preserve"> 1.0 — outubro de 2026</w:t>
+        <w:t xml:space="preserve"> 1.1 — outubro de 2026</w:t>
       </w:r>
     </w:p>
     <w:p>
@@ -159,7 +159,7 @@
     <w:sdt>
       <w:sdtPr>
         <w:alias w:val="Sumário"/>
-        <w:id w:val="1204746103"/>
+        <w:id w:val="-42299590"/>
       </w:sdtPr>
       <w:sdtEndPr/>
       <w:sdtContent>
@@ -188,7 +188,7 @@
           <w:r>
             <w:fldChar w:fldCharType="separate"/>
           </w:r>
-          <w:hyperlink w:anchor="_Toc242839274" w:history="1">
+          <w:hyperlink w:anchor="_Toc242841191" w:history="1">
             <w:r>
               <w:rPr>
                 <w:rStyle w:val="Hyperlink"/>
@@ -212,7 +212,7 @@
               <w:rPr>
                 <w:noProof/>
               </w:rPr>
-              <w:instrText xml:space="preserve"> PAGEREF _Toc242839274 \h </w:instrText>
+              <w:instrText xml:space="preserve"> PAGEREF _Toc242841191 \h </w:instrText>
             </w:r>
             <w:r>
               <w:rPr>
@@ -255,7 +255,7 @@
               <w14:ligatures w14:val="standardContextual"/>
             </w:rPr>
           </w:pPr>
-          <w:hyperlink w:anchor="_Toc242839275" w:history="1">
+          <w:hyperlink w:anchor="_Toc242841192" w:history="1">
             <w:r>
               <w:rPr>
                 <w:rStyle w:val="Hyperlink"/>
@@ -279,7 +279,7 @@
               <w:rPr>
                 <w:noProof/>
               </w:rPr>
-              <w:instrText xml:space="preserve"> PAGEREF _Toc242839275 \h </w:instrText>
+              <w:instrText xml:space="preserve"> PAGEREF _Toc242841192 \h </w:instrText>
             </w:r>
             <w:r>
               <w:rPr>
@@ -322,7 +322,7 @@
               <w14:ligatures w14:val="standardContextual"/>
             </w:rPr>
           </w:pPr>
-          <w:hyperlink w:anchor="_Toc242839276" w:history="1">
+          <w:hyperlink w:anchor="_Toc242841193" w:history="1">
             <w:r>
               <w:rPr>
                 <w:rStyle w:val="Hyperlink"/>
@@ -346,7 +346,7 @@
               <w:rPr>
                 <w:noProof/>
               </w:rPr>
-              <w:instrText xml:space="preserve"> PAGEREF _Toc242839276 \h </w:instrText>
+              <w:instrText xml:space="preserve"> PAGEREF _Toc242841193 \h </w:instrText>
             </w:r>
             <w:r>
               <w:rPr>
@@ -389,7 +389,7 @@
               <w14:ligatures w14:val="standardContextual"/>
             </w:rPr>
           </w:pPr>
-          <w:hyperlink w:anchor="_Toc242839277" w:history="1">
+          <w:hyperlink w:anchor="_Toc242841194" w:history="1">
             <w:r>
               <w:rPr>
                 <w:rStyle w:val="Hyperlink"/>
@@ -413,7 +413,7 @@
               <w:rPr>
                 <w:noProof/>
               </w:rPr>
-              <w:instrText xml:space="preserve"> PAGEREF _Toc242839277 \h </w:instrText>
+              <w:instrText xml:space="preserve"> PAGEREF _Toc242841194 \h </w:instrText>
             </w:r>
             <w:r>
               <w:rPr>
@@ -456,7 +456,7 @@
               <w14:ligatures w14:val="standardContextual"/>
             </w:rPr>
           </w:pPr>
-          <w:hyperlink w:anchor="_Toc242839278" w:history="1">
+          <w:hyperlink w:anchor="_Toc242841195" w:history="1">
             <w:r>
               <w:rPr>
                 <w:rStyle w:val="Hyperlink"/>
@@ -480,7 +480,7 @@
               <w:rPr>
                 <w:noProof/>
               </w:rPr>
-              <w:instrText xml:space="preserve"> PAGEREF _Toc242839278 \h </w:instrText>
+              <w:instrText xml:space="preserve"> PAGEREF _Toc242841195 \h </w:instrText>
             </w:r>
             <w:r>
               <w:rPr>
@@ -523,7 +523,7 @@
               <w14:ligatures w14:val="standardContextual"/>
             </w:rPr>
           </w:pPr>
-          <w:hyperlink w:anchor="_Toc242839279" w:history="1">
+          <w:hyperlink w:anchor="_Toc242841196" w:history="1">
             <w:r>
               <w:rPr>
                 <w:rStyle w:val="Hyperlink"/>
@@ -547,7 +547,7 @@
               <w:rPr>
                 <w:noProof/>
               </w:rPr>
-              <w:instrText xml:space="preserve"> PAGEREF _Toc242839279 \h </w:instrText>
+              <w:instrText xml:space="preserve"> PAGEREF _Toc242841196 \h </w:instrText>
             </w:r>
             <w:r>
               <w:rPr>
@@ -590,7 +590,7 @@
               <w14:ligatures w14:val="standardContextual"/>
             </w:rPr>
           </w:pPr>
-          <w:hyperlink w:anchor="_Toc242839280" w:history="1">
+          <w:hyperlink w:anchor="_Toc242841197" w:history="1">
             <w:r>
               <w:rPr>
                 <w:rStyle w:val="Hyperlink"/>
@@ -614,7 +614,7 @@
               <w:rPr>
                 <w:noProof/>
               </w:rPr>
-              <w:instrText xml:space="preserve"> PAGEREF _Toc242839280 \h </w:instrText>
+              <w:instrText xml:space="preserve"> PAGEREF _Toc242841197 \h </w:instrText>
             </w:r>
             <w:r>
               <w:rPr>
@@ -657,7 +657,7 @@
               <w14:ligatures w14:val="standardContextual"/>
             </w:rPr>
           </w:pPr>
-          <w:hyperlink w:anchor="_Toc242839281" w:history="1">
+          <w:hyperlink w:anchor="_Toc242841198" w:history="1">
             <w:r>
               <w:rPr>
                 <w:rStyle w:val="Hyperlink"/>
@@ -681,7 +681,7 @@
               <w:rPr>
                 <w:noProof/>
               </w:rPr>
-              <w:instrText xml:space="preserve"> PAGEREF _Toc242839281 \h </w:instrText>
+              <w:instrText xml:space="preserve"> PAGEREF _Toc242841198 \h </w:instrText>
             </w:r>
             <w:r>
               <w:rPr>
@@ -724,7 +724,7 @@
               <w14:ligatures w14:val="standardContextual"/>
             </w:rPr>
           </w:pPr>
-          <w:hyperlink w:anchor="_Toc242839282" w:history="1">
+          <w:hyperlink w:anchor="_Toc242841199" w:history="1">
             <w:r>
               <w:rPr>
                 <w:rStyle w:val="Hyperlink"/>
@@ -748,7 +748,7 @@
               <w:rPr>
                 <w:noProof/>
               </w:rPr>
-              <w:instrText xml:space="preserve"> PAGEREF _Toc242839282 \h </w:instrText>
+              <w:instrText xml:space="preserve"> PAGEREF _Toc242841199 \h </w:instrText>
             </w:r>
             <w:r>
               <w:rPr>
@@ -791,7 +791,7 @@
               <w14:ligatures w14:val="standardContextual"/>
             </w:rPr>
           </w:pPr>
-          <w:hyperlink w:anchor="_Toc242839283" w:history="1">
+          <w:hyperlink w:anchor="_Toc242841200" w:history="1">
             <w:r>
               <w:rPr>
                 <w:rStyle w:val="Hyperlink"/>
@@ -815,7 +815,7 @@
               <w:rPr>
                 <w:noProof/>
               </w:rPr>
-              <w:instrText xml:space="preserve"> PAGEREF _Toc242839283 \h </w:instrText>
+              <w:instrText xml:space="preserve"> PAGEREF _Toc242841200 \h </w:instrText>
             </w:r>
             <w:r>
               <w:rPr>
@@ -858,7 +858,7 @@
               <w14:ligatures w14:val="standardContextual"/>
             </w:rPr>
           </w:pPr>
-          <w:hyperlink w:anchor="_Toc242839284" w:history="1">
+          <w:hyperlink w:anchor="_Toc242841201" w:history="1">
             <w:r>
               <w:rPr>
                 <w:rStyle w:val="Hyperlink"/>
@@ -882,7 +882,7 @@
               <w:rPr>
                 <w:noProof/>
               </w:rPr>
-              <w:instrText xml:space="preserve"> PAGEREF _Toc242839284 \h </w:instrText>
+              <w:instrText xml:space="preserve"> PAGEREF _Toc242841201 \h </w:instrText>
             </w:r>
             <w:r>
               <w:rPr>
@@ -925,7 +925,7 @@
               <w14:ligatures w14:val="standardContextual"/>
             </w:rPr>
           </w:pPr>
-          <w:hyperlink w:anchor="_Toc242839285" w:history="1">
+          <w:hyperlink w:anchor="_Toc242841202" w:history="1">
             <w:r>
               <w:rPr>
                 <w:rStyle w:val="Hyperlink"/>
@@ -949,7 +949,7 @@
               <w:rPr>
                 <w:noProof/>
               </w:rPr>
-              <w:instrText xml:space="preserve"> PAGEREF _Toc242839285 \h </w:instrText>
+              <w:instrText xml:space="preserve"> PAGEREF _Toc242841202 \h </w:instrText>
             </w:r>
             <w:r>
               <w:rPr>
@@ -992,7 +992,7 @@
               <w14:ligatures w14:val="standardContextual"/>
             </w:rPr>
           </w:pPr>
-          <w:hyperlink w:anchor="_Toc242839286" w:history="1">
+          <w:hyperlink w:anchor="_Toc242841203" w:history="1">
             <w:r>
               <w:rPr>
                 <w:rStyle w:val="Hyperlink"/>
@@ -1016,7 +1016,7 @@
               <w:rPr>
                 <w:noProof/>
               </w:rPr>
-              <w:instrText xml:space="preserve"> PAGEREF _Toc242839286 \h </w:instrText>
+              <w:instrText xml:space="preserve"> PAGEREF _Toc242841203 \h </w:instrText>
             </w:r>
             <w:r>
               <w:rPr>
@@ -1059,7 +1059,7 @@
               <w14:ligatures w14:val="standardContextual"/>
             </w:rPr>
           </w:pPr>
-          <w:hyperlink w:anchor="_Toc242839287" w:history="1">
+          <w:hyperlink w:anchor="_Toc242841204" w:history="1">
             <w:r>
               <w:rPr>
                 <w:rStyle w:val="Hyperlink"/>
@@ -1083,7 +1083,7 @@
               <w:rPr>
                 <w:noProof/>
               </w:rPr>
-              <w:instrText xml:space="preserve"> PAGEREF _Toc242839287 \h </w:instrText>
+              <w:instrText xml:space="preserve"> PAGEREF _Toc242841204 \h </w:instrText>
             </w:r>
             <w:r>
               <w:rPr>
@@ -1126,7 +1126,7 @@
               <w14:ligatures w14:val="standardContextual"/>
             </w:rPr>
           </w:pPr>
-          <w:hyperlink w:anchor="_Toc242839288" w:history="1">
+          <w:hyperlink w:anchor="_Toc242841205" w:history="1">
             <w:r>
               <w:rPr>
                 <w:rStyle w:val="Hyperlink"/>
@@ -1150,7 +1150,7 @@
               <w:rPr>
                 <w:noProof/>
               </w:rPr>
-              <w:instrText xml:space="preserve"> PAGEREF _Toc242839288 \h </w:instrText>
+              <w:instrText xml:space="preserve"> PAGEREF _Toc242841205 \h </w:instrText>
             </w:r>
             <w:r>
               <w:rPr>
@@ -1167,7 +1167,7 @@
               <w:rPr>
                 <w:noProof/>
               </w:rPr>
-              <w:t>8</w:t>
+              <w:t>9</w:t>
             </w:r>
             <w:r>
               <w:rPr>
@@ -1193,7 +1193,7 @@
               <w14:ligatures w14:val="standardContextual"/>
             </w:rPr>
           </w:pPr>
-          <w:hyperlink w:anchor="_Toc242839289" w:history="1">
+          <w:hyperlink w:anchor="_Toc242841206" w:history="1">
             <w:r>
               <w:rPr>
                 <w:rStyle w:val="Hyperlink"/>
@@ -1217,7 +1217,7 @@
               <w:rPr>
                 <w:noProof/>
               </w:rPr>
-              <w:instrText xml:space="preserve"> PAGEREF _Toc242839289 \h </w:instrText>
+              <w:instrText xml:space="preserve"> PAGEREF _Toc242841206 \h </w:instrText>
             </w:r>
             <w:r>
               <w:rPr>
@@ -1234,7 +1234,7 @@
               <w:rPr>
                 <w:noProof/>
               </w:rPr>
-              <w:t>9</w:t>
+              <w:t>10</w:t>
             </w:r>
             <w:r>
               <w:rPr>
@@ -1260,7 +1260,7 @@
               <w14:ligatures w14:val="standardContextual"/>
             </w:rPr>
           </w:pPr>
-          <w:hyperlink w:anchor="_Toc242839290" w:history="1">
+          <w:hyperlink w:anchor="_Toc242841207" w:history="1">
             <w:r>
               <w:rPr>
                 <w:rStyle w:val="Hyperlink"/>
@@ -1284,7 +1284,7 @@
               <w:rPr>
                 <w:noProof/>
               </w:rPr>
-              <w:instrText xml:space="preserve"> PAGEREF _Toc242839290 \h </w:instrText>
+              <w:instrText xml:space="preserve"> PAGEREF _Toc242841207 \h </w:instrText>
             </w:r>
             <w:r>
               <w:rPr>
@@ -1301,7 +1301,7 @@
               <w:rPr>
                 <w:noProof/>
               </w:rPr>
-              <w:t>9</w:t>
+              <w:t>10</w:t>
             </w:r>
             <w:r>
               <w:rPr>
@@ -1327,7 +1327,7 @@
               <w14:ligatures w14:val="standardContextual"/>
             </w:rPr>
           </w:pPr>
-          <w:hyperlink w:anchor="_Toc242839291" w:history="1">
+          <w:hyperlink w:anchor="_Toc242841208" w:history="1">
             <w:r>
               <w:rPr>
                 <w:rStyle w:val="Hyperlink"/>
@@ -1351,7 +1351,7 @@
               <w:rPr>
                 <w:noProof/>
               </w:rPr>
-              <w:instrText xml:space="preserve"> PAGEREF _Toc242839291 \h </w:instrText>
+              <w:instrText xml:space="preserve"> PAGEREF _Toc242841208 \h </w:instrText>
             </w:r>
             <w:r>
               <w:rPr>
@@ -1394,7 +1394,7 @@
               <w14:ligatures w14:val="standardContextual"/>
             </w:rPr>
           </w:pPr>
-          <w:hyperlink w:anchor="_Toc242839292" w:history="1">
+          <w:hyperlink w:anchor="_Toc242841209" w:history="1">
             <w:r>
               <w:rPr>
                 <w:rStyle w:val="Hyperlink"/>
@@ -1427,7 +1427,7 @@
               <w:rPr>
                 <w:noProof/>
               </w:rPr>
-              <w:instrText xml:space="preserve"> PAGEREF _Toc242839292 \h </w:instrText>
+              <w:instrText xml:space="preserve"> PAGEREF _Toc242841209 \h </w:instrText>
             </w:r>
             <w:r>
               <w:rPr>
@@ -1470,7 +1470,7 @@
               <w14:ligatures w14:val="standardContextual"/>
             </w:rPr>
           </w:pPr>
-          <w:hyperlink w:anchor="_Toc242839293" w:history="1">
+          <w:hyperlink w:anchor="_Toc242841210" w:history="1">
             <w:r>
               <w:rPr>
                 <w:rStyle w:val="Hyperlink"/>
@@ -1494,7 +1494,7 @@
               <w:rPr>
                 <w:noProof/>
               </w:rPr>
-              <w:instrText xml:space="preserve"> PAGEREF _Toc242839293 \h </w:instrText>
+              <w:instrText xml:space="preserve"> PAGEREF _Toc242841210 \h </w:instrText>
             </w:r>
             <w:r>
               <w:rPr>
@@ -1537,7 +1537,7 @@
               <w14:ligatures w14:val="standardContextual"/>
             </w:rPr>
           </w:pPr>
-          <w:hyperlink w:anchor="_Toc242839294" w:history="1">
+          <w:hyperlink w:anchor="_Toc242841211" w:history="1">
             <w:r>
               <w:rPr>
                 <w:rStyle w:val="Hyperlink"/>
@@ -1561,7 +1561,7 @@
               <w:rPr>
                 <w:noProof/>
               </w:rPr>
-              <w:instrText xml:space="preserve"> PAGEREF _Toc242839294 \h </w:instrText>
+              <w:instrText xml:space="preserve"> PAGEREF _Toc242841211 \h </w:instrText>
             </w:r>
             <w:r>
               <w:rPr>
@@ -1604,7 +1604,7 @@
               <w14:ligatures w14:val="standardContextual"/>
             </w:rPr>
           </w:pPr>
-          <w:hyperlink w:anchor="_Toc242839295" w:history="1">
+          <w:hyperlink w:anchor="_Toc242841212" w:history="1">
             <w:r>
               <w:rPr>
                 <w:rStyle w:val="Hyperlink"/>
@@ -1628,7 +1628,7 @@
               <w:rPr>
                 <w:noProof/>
               </w:rPr>
-              <w:instrText xml:space="preserve"> PAGEREF _Toc242839295 \h </w:instrText>
+              <w:instrText xml:space="preserve"> PAGEREF _Toc242841212 \h </w:instrText>
             </w:r>
             <w:r>
               <w:rPr>
@@ -1671,7 +1671,7 @@
               <w14:ligatures w14:val="standardContextual"/>
             </w:rPr>
           </w:pPr>
-          <w:hyperlink w:anchor="_Toc242839296" w:history="1">
+          <w:hyperlink w:anchor="_Toc242841213" w:history="1">
             <w:r>
               <w:rPr>
                 <w:rStyle w:val="Hyperlink"/>
@@ -1695,7 +1695,7 @@
               <w:rPr>
                 <w:noProof/>
               </w:rPr>
-              <w:instrText xml:space="preserve"> PAGEREF _Toc242839296 \h </w:instrText>
+              <w:instrText xml:space="preserve"> PAGEREF _Toc242841213 \h </w:instrText>
             </w:r>
             <w:r>
               <w:rPr>
@@ -1738,7 +1738,7 @@
               <w14:ligatures w14:val="standardContextual"/>
             </w:rPr>
           </w:pPr>
-          <w:hyperlink w:anchor="_Toc242839297" w:history="1">
+          <w:hyperlink w:anchor="_Toc242841214" w:history="1">
             <w:r>
               <w:rPr>
                 <w:rStyle w:val="Hyperlink"/>
@@ -1762,7 +1762,7 @@
               <w:rPr>
                 <w:noProof/>
               </w:rPr>
-              <w:instrText xml:space="preserve"> PAGEREF _Toc242839297 \h </w:instrText>
+              <w:instrText xml:space="preserve"> PAGEREF _Toc242841214 \h </w:instrText>
             </w:r>
             <w:r>
               <w:rPr>
@@ -1805,7 +1805,7 @@
               <w14:ligatures w14:val="standardContextual"/>
             </w:rPr>
           </w:pPr>
-          <w:hyperlink w:anchor="_Toc242839298" w:history="1">
+          <w:hyperlink w:anchor="_Toc242841215" w:history="1">
             <w:r>
               <w:rPr>
                 <w:rStyle w:val="Hyperlink"/>
@@ -1829,7 +1829,7 @@
               <w:rPr>
                 <w:noProof/>
               </w:rPr>
-              <w:instrText xml:space="preserve"> PAGEREF _Toc242839298 \h </w:instrText>
+              <w:instrText xml:space="preserve"> PAGEREF _Toc242841215 \h </w:instrText>
             </w:r>
             <w:r>
               <w:rPr>
@@ -1872,7 +1872,7 @@
               <w14:ligatures w14:val="standardContextual"/>
             </w:rPr>
           </w:pPr>
-          <w:hyperlink w:anchor="_Toc242839299" w:history="1">
+          <w:hyperlink w:anchor="_Toc242841216" w:history="1">
             <w:r>
               <w:rPr>
                 <w:rStyle w:val="Hyperlink"/>
@@ -1896,7 +1896,7 @@
               <w:rPr>
                 <w:noProof/>
               </w:rPr>
-              <w:instrText xml:space="preserve"> PAGEREF _Toc242839299 \h </w:instrText>
+              <w:instrText xml:space="preserve"> PAGEREF _Toc242841216 \h </w:instrText>
             </w:r>
             <w:r>
               <w:rPr>
@@ -1939,7 +1939,7 @@
               <w14:ligatures w14:val="standardContextual"/>
             </w:rPr>
           </w:pPr>
-          <w:hyperlink w:anchor="_Toc242839300" w:history="1">
+          <w:hyperlink w:anchor="_Toc242841217" w:history="1">
             <w:r>
               <w:rPr>
                 <w:rStyle w:val="Hyperlink"/>
@@ -1963,7 +1963,7 @@
               <w:rPr>
                 <w:noProof/>
               </w:rPr>
-              <w:instrText xml:space="preserve"> PAGEREF _Toc242839300 \h </w:instrText>
+              <w:instrText xml:space="preserve"> PAGEREF _Toc242841217 \h </w:instrText>
             </w:r>
             <w:r>
               <w:rPr>
@@ -2006,7 +2006,7 @@
               <w14:ligatures w14:val="standardContextual"/>
             </w:rPr>
           </w:pPr>
-          <w:hyperlink w:anchor="_Toc242839301" w:history="1">
+          <w:hyperlink w:anchor="_Toc242841218" w:history="1">
             <w:r>
               <w:rPr>
                 <w:rStyle w:val="Hyperlink"/>
@@ -2030,7 +2030,7 @@
               <w:rPr>
                 <w:noProof/>
               </w:rPr>
-              <w:instrText xml:space="preserve"> PAGEREF _Toc242839301 \h </w:instrText>
+              <w:instrText xml:space="preserve"> PAGEREF _Toc242841218 \h </w:instrText>
             </w:r>
             <w:r>
               <w:rPr>
@@ -2073,7 +2073,7 @@
               <w14:ligatures w14:val="standardContextual"/>
             </w:rPr>
           </w:pPr>
-          <w:hyperlink w:anchor="_Toc242839302" w:history="1">
+          <w:hyperlink w:anchor="_Toc242841219" w:history="1">
             <w:r>
               <w:rPr>
                 <w:rStyle w:val="Hyperlink"/>
@@ -2097,7 +2097,7 @@
               <w:rPr>
                 <w:noProof/>
               </w:rPr>
-              <w:instrText xml:space="preserve"> PAGEREF _Toc242839302 \h </w:instrText>
+              <w:instrText xml:space="preserve"> PAGEREF _Toc242841219 \h </w:instrText>
             </w:r>
             <w:r>
               <w:rPr>
@@ -2140,7 +2140,7 @@
               <w14:ligatures w14:val="standardContextual"/>
             </w:rPr>
           </w:pPr>
-          <w:hyperlink w:anchor="_Toc242839303" w:history="1">
+          <w:hyperlink w:anchor="_Toc242841220" w:history="1">
             <w:r>
               <w:rPr>
                 <w:rStyle w:val="Hyperlink"/>
@@ -2164,7 +2164,7 @@
               <w:rPr>
                 <w:noProof/>
               </w:rPr>
-              <w:instrText xml:space="preserve"> PAGEREF _Toc242839303 \h </w:instrText>
+              <w:instrText xml:space="preserve"> PAGEREF _Toc242841220 \h </w:instrText>
             </w:r>
             <w:r>
               <w:rPr>
@@ -2207,7 +2207,7 @@
               <w14:ligatures w14:val="standardContextual"/>
             </w:rPr>
           </w:pPr>
-          <w:hyperlink w:anchor="_Toc242839304" w:history="1">
+          <w:hyperlink w:anchor="_Toc242841221" w:history="1">
             <w:r>
               <w:rPr>
                 <w:rStyle w:val="Hyperlink"/>
@@ -2231,7 +2231,7 @@
               <w:rPr>
                 <w:noProof/>
               </w:rPr>
-              <w:instrText xml:space="preserve"> PAGEREF _Toc242839304 \h </w:instrText>
+              <w:instrText xml:space="preserve"> PAGEREF _Toc242841221 \h </w:instrText>
             </w:r>
             <w:r>
               <w:rPr>
@@ -2274,7 +2274,7 @@
               <w14:ligatures w14:val="standardContextual"/>
             </w:rPr>
           </w:pPr>
-          <w:hyperlink w:anchor="_Toc242839305" w:history="1">
+          <w:hyperlink w:anchor="_Toc242841222" w:history="1">
             <w:r>
               <w:rPr>
                 <w:rStyle w:val="Hyperlink"/>
@@ -2298,7 +2298,7 @@
               <w:rPr>
                 <w:noProof/>
               </w:rPr>
-              <w:instrText xml:space="preserve"> PAGEREF _Toc242839305 \h </w:instrText>
+              <w:instrText xml:space="preserve"> PAGEREF _Toc242841222 \h </w:instrText>
             </w:r>
             <w:r>
               <w:rPr>
@@ -2341,7 +2341,7 @@
               <w14:ligatures w14:val="standardContextual"/>
             </w:rPr>
           </w:pPr>
-          <w:hyperlink w:anchor="_Toc242839306" w:history="1">
+          <w:hyperlink w:anchor="_Toc242841223" w:history="1">
             <w:r>
               <w:rPr>
                 <w:rStyle w:val="Hyperlink"/>
@@ -2365,7 +2365,7 @@
               <w:rPr>
                 <w:noProof/>
               </w:rPr>
-              <w:instrText xml:space="preserve"> PAGEREF _Toc242839306 \h </w:instrText>
+              <w:instrText xml:space="preserve"> PAGEREF _Toc242841223 \h </w:instrText>
             </w:r>
             <w:r>
               <w:rPr>
@@ -2408,7 +2408,7 @@
               <w14:ligatures w14:val="standardContextual"/>
             </w:rPr>
           </w:pPr>
-          <w:hyperlink w:anchor="_Toc242839307" w:history="1">
+          <w:hyperlink w:anchor="_Toc242841224" w:history="1">
             <w:r>
               <w:rPr>
                 <w:rStyle w:val="Hyperlink"/>
@@ -2432,7 +2432,7 @@
               <w:rPr>
                 <w:noProof/>
               </w:rPr>
-              <w:instrText xml:space="preserve"> PAGEREF _Toc242839307 \h </w:instrText>
+              <w:instrText xml:space="preserve"> PAGEREF _Toc242841224 \h </w:instrText>
             </w:r>
             <w:r>
               <w:rPr>
@@ -2475,7 +2475,7 @@
               <w14:ligatures w14:val="standardContextual"/>
             </w:rPr>
           </w:pPr>
-          <w:hyperlink w:anchor="_Toc242839308" w:history="1">
+          <w:hyperlink w:anchor="_Toc242841225" w:history="1">
             <w:r>
               <w:rPr>
                 <w:rStyle w:val="Hyperlink"/>
@@ -2499,7 +2499,7 @@
               <w:rPr>
                 <w:noProof/>
               </w:rPr>
-              <w:instrText xml:space="preserve"> PAGEREF _Toc242839308 \h </w:instrText>
+              <w:instrText xml:space="preserve"> PAGEREF _Toc242841225 \h </w:instrText>
             </w:r>
             <w:r>
               <w:rPr>
@@ -2542,7 +2542,7 @@
               <w14:ligatures w14:val="standardContextual"/>
             </w:rPr>
           </w:pPr>
-          <w:hyperlink w:anchor="_Toc242839309" w:history="1">
+          <w:hyperlink w:anchor="_Toc242841226" w:history="1">
             <w:r>
               <w:rPr>
                 <w:rStyle w:val="Hyperlink"/>
@@ -2566,7 +2566,7 @@
               <w:rPr>
                 <w:noProof/>
               </w:rPr>
-              <w:instrText xml:space="preserve"> PAGEREF _Toc242839309 \h </w:instrText>
+              <w:instrText xml:space="preserve"> PAGEREF _Toc242841226 \h </w:instrText>
             </w:r>
             <w:r>
               <w:rPr>
@@ -2583,7 +2583,7 @@
               <w:rPr>
                 <w:noProof/>
               </w:rPr>
-              <w:t>19</w:t>
+              <w:t>20</w:t>
             </w:r>
             <w:r>
               <w:rPr>
@@ -2609,7 +2609,7 @@
       <w:pPr>
         <w:pStyle w:val="Ttulo1"/>
       </w:pPr>
-      <w:bookmarkStart w:id="0" w:name="_Toc242839274"/>
+      <w:bookmarkStart w:id="0" w:name="_Toc242841191"/>
       <w:r>
         <w:rPr>
           <w:color w:val="191B2E"/>
@@ -2768,7 +2768,7 @@
       <w:pPr>
         <w:pStyle w:val="Ttulo1"/>
       </w:pPr>
-      <w:bookmarkStart w:id="1" w:name="_Toc242839275"/>
+      <w:bookmarkStart w:id="1" w:name="_Toc242841192"/>
       <w:r>
         <w:rPr>
           <w:color w:val="191B2E"/>
@@ -2781,7 +2781,7 @@
       <w:pPr>
         <w:pStyle w:val="Ttulo2"/>
       </w:pPr>
-      <w:bookmarkStart w:id="2" w:name="_Toc242839276"/>
+      <w:bookmarkStart w:id="2" w:name="_Toc242841193"/>
       <w:r>
         <w:t>2.1 Visão geral</w:t>
       </w:r>
@@ -3384,7 +3384,7 @@
       <w:pPr>
         <w:pStyle w:val="Ttulo2"/>
       </w:pPr>
-      <w:bookmarkStart w:id="3" w:name="_Toc242839277"/>
+      <w:bookmarkStart w:id="3" w:name="_Toc242841194"/>
       <w:r>
         <w:lastRenderedPageBreak/>
         <w:t>2.2 Diagrama de implantação</w:t>
@@ -3402,7 +3402,7 @@
           <w:noProof/>
         </w:rPr>
         <w:drawing>
-          <wp:inline distT="0" distB="0" distL="0" distR="0" wp14:anchorId="423DC6CA" wp14:editId="570004D4">
+          <wp:inline distT="0" distB="0" distL="0" distR="0" wp14:anchorId="18F0DFAA" wp14:editId="6BC144FD">
             <wp:extent cx="5905500" cy="7448550"/>
             <wp:effectExtent l="0" t="0" r="0" b="0"/>
             <wp:docPr id="1" name="Imagem 1"/>
@@ -3561,7 +3561,7 @@
       <w:pPr>
         <w:pStyle w:val="Ttulo2"/>
       </w:pPr>
-      <w:bookmarkStart w:id="4" w:name="_Toc242839278"/>
+      <w:bookmarkStart w:id="4" w:name="_Toc242841195"/>
       <w:r>
         <w:t>2.3 Tecnologias e versões</w:t>
       </w:r>
@@ -4429,7 +4429,7 @@
       <w:pPr>
         <w:pStyle w:val="Ttulo2"/>
       </w:pPr>
-      <w:bookmarkStart w:id="5" w:name="_Toc242839279"/>
+      <w:bookmarkStart w:id="5" w:name="_Toc242841196"/>
       <w:r>
         <w:t>2.4 Camadas da API</w:t>
       </w:r>
@@ -4446,10 +4446,10 @@
           <w:noProof/>
         </w:rPr>
         <w:drawing>
-          <wp:inline distT="0" distB="0" distL="0" distR="0" wp14:anchorId="36C623DD" wp14:editId="6A5AAFDF">
+          <wp:inline distT="0" distB="0" distL="0" distR="0" wp14:anchorId="70807BA5" wp14:editId="0C144BC6">
             <wp:extent cx="5905500" cy="5229225"/>
             <wp:effectExtent l="0" t="0" r="0" b="0"/>
-            <wp:docPr id="921128862" name="Imagem 921128862"/>
+            <wp:docPr id="1252387189" name="Imagem 1252387189"/>
             <wp:cNvGraphicFramePr>
               <a:graphicFrameLocks xmlns:a="http://schemas.openxmlformats.org/drawingml/2006/main" noChangeAspect="1"/>
             </wp:cNvGraphicFramePr>
@@ -5511,7 +5511,7 @@
       <w:pPr>
         <w:pStyle w:val="Ttulo1"/>
       </w:pPr>
-      <w:bookmarkStart w:id="6" w:name="_Toc242839280"/>
+      <w:bookmarkStart w:id="6" w:name="_Toc242841197"/>
       <w:r>
         <w:rPr>
           <w:color w:val="191B2E"/>
@@ -5524,7 +5524,7 @@
       <w:pPr>
         <w:pStyle w:val="Ttulo2"/>
       </w:pPr>
-      <w:bookmarkStart w:id="7" w:name="_Toc242839281"/>
+      <w:bookmarkStart w:id="7" w:name="_Toc242841198"/>
       <w:r>
         <w:t>3.1 Pré-requisitos</w:t>
       </w:r>
@@ -6112,7 +6112,7 @@
       <w:pPr>
         <w:pStyle w:val="Ttulo2"/>
       </w:pPr>
-      <w:bookmarkStart w:id="8" w:name="_Toc242839282"/>
+      <w:bookmarkStart w:id="8" w:name="_Toc242841199"/>
       <w:r>
         <w:t>3.2 Obter o código</w:t>
       </w:r>
@@ -6172,7 +6172,7 @@
       <w:pPr>
         <w:pStyle w:val="Ttulo2"/>
       </w:pPr>
-      <w:bookmarkStart w:id="9" w:name="_Toc242839283"/>
+      <w:bookmarkStart w:id="9" w:name="_Toc242841200"/>
       <w:r>
         <w:t>3.3 Subir a aplicação com Docker</w:t>
       </w:r>
@@ -7285,7 +7285,7 @@
       <w:pPr>
         <w:pStyle w:val="Ttulo2"/>
       </w:pPr>
-      <w:bookmarkStart w:id="10" w:name="_Toc242839284"/>
+      <w:bookmarkStart w:id="10" w:name="_Toc242841201"/>
       <w:r>
         <w:t>3.4 Usuários de teste</w:t>
       </w:r>
@@ -8054,7 +8054,7 @@
       <w:pPr>
         <w:pStyle w:val="Ttulo2"/>
       </w:pPr>
-      <w:bookmarkStart w:id="11" w:name="_Toc242839285"/>
+      <w:bookmarkStart w:id="11" w:name="_Toc242841202"/>
       <w:r>
         <w:t>3.5 Desenvolver com recarga automática</w:t>
       </w:r>
@@ -8344,7 +8344,7 @@
       <w:pPr>
         <w:pStyle w:val="Ttulo2"/>
       </w:pPr>
-      <w:bookmarkStart w:id="12" w:name="_Toc242839286"/>
+      <w:bookmarkStart w:id="12" w:name="_Toc242841203"/>
       <w:r>
         <w:t>3.6 Variáveis de ambiente da API</w:t>
       </w:r>
@@ -9553,7 +9553,7 @@
       <w:pPr>
         <w:pStyle w:val="Ttulo2"/>
       </w:pPr>
-      <w:bookmarkStart w:id="13" w:name="_Toc242839287"/>
+      <w:bookmarkStart w:id="13" w:name="_Toc242841204"/>
       <w:r>
         <w:t>3.7 Testes automatizados</w:t>
       </w:r>
@@ -9615,7 +9615,7 @@
         <w:spacing w:after="140" w:line="288" w:lineRule="auto"/>
       </w:pPr>
       <w:r>
-        <w:t>São 14 testes, que não precisam de banco:</w:t>
+        <w:t>São 20 testes, que não precisam de banco:</w:t>
       </w:r>
     </w:p>
     <w:tbl>
@@ -9858,6 +9858,78 @@
           </w:p>
         </w:tc>
       </w:tr>
+      <w:tr>
+        <w:tblPrEx>
+          <w:tblCellMar>
+            <w:top w:w="0" w:type="dxa"/>
+            <w:bottom w:w="0" w:type="dxa"/>
+          </w:tblCellMar>
+        </w:tblPrEx>
+        <w:trPr>
+          <w:cantSplit/>
+        </w:trPr>
+        <w:tc>
+          <w:tcPr>
+            <w:tcW w:w="2585" w:type="dxa"/>
+            <w:tcBorders>
+              <w:top w:val="single" w:sz="4" w:space="0" w:color="D9DAE6"/>
+              <w:left w:val="single" w:sz="4" w:space="0" w:color="D9DAE6"/>
+              <w:bottom w:val="single" w:sz="4" w:space="0" w:color="D9DAE6"/>
+              <w:right w:val="single" w:sz="4" w:space="0" w:color="D9DAE6"/>
+            </w:tcBorders>
+            <w:tcMar>
+              <w:top w:w="60" w:type="dxa"/>
+              <w:left w:w="100" w:type="dxa"/>
+              <w:bottom w:w="60" w:type="dxa"/>
+              <w:right w:w="100" w:type="dxa"/>
+            </w:tcMar>
+          </w:tcPr>
+          <w:p>
+            <w:pPr>
+              <w:spacing w:line="252" w:lineRule="auto"/>
+            </w:pPr>
+            <w:r>
+              <w:rPr>
+                <w:rFonts w:ascii="Consolas" w:eastAsia="Consolas" w:hAnsi="Consolas" w:cs="Consolas"/>
+                <w:color w:val="3730A3"/>
+                <w:sz w:val="17"/>
+                <w:szCs w:val="17"/>
+                <w:shd w:val="clear" w:color="auto" w:fill="F4F4F8"/>
+              </w:rPr>
+              <w:t>test/dica.test.js</w:t>
+            </w:r>
+          </w:p>
+        </w:tc>
+        <w:tc>
+          <w:tcPr>
+            <w:tcW w:w="7053" w:type="dxa"/>
+            <w:tcBorders>
+              <w:top w:val="single" w:sz="4" w:space="0" w:color="D9DAE6"/>
+              <w:left w:val="single" w:sz="4" w:space="0" w:color="D9DAE6"/>
+              <w:bottom w:val="single" w:sz="4" w:space="0" w:color="D9DAE6"/>
+              <w:right w:val="single" w:sz="4" w:space="0" w:color="D9DAE6"/>
+            </w:tcBorders>
+            <w:tcMar>
+              <w:top w:w="60" w:type="dxa"/>
+              <w:left w:w="100" w:type="dxa"/>
+              <w:bottom w:w="60" w:type="dxa"/>
+              <w:right w:w="100" w:type="dxa"/>
+            </w:tcMar>
+          </w:tcPr>
+          <w:p>
+            <w:pPr>
+              <w:spacing w:line="252" w:lineRule="auto"/>
+            </w:pPr>
+            <w:r>
+              <w:rPr>
+                <w:sz w:val="19"/>
+                <w:szCs w:val="19"/>
+              </w:rPr>
+              <w:t>Dica "revelar letra": escolhe a primeira casa vazia, não depende de a letra digitada estar certa, pula casas já reveladas, letra num cruzamento conta para as duas palavras, desconto de 20% por letra</w:t>
+            </w:r>
+          </w:p>
+        </w:tc>
+      </w:tr>
     </w:tbl>
     <w:p>
       <w:pPr>
@@ -9868,11 +9940,12 @@
       <w:pPr>
         <w:pStyle w:val="Ttulo1"/>
       </w:pPr>
-      <w:bookmarkStart w:id="14" w:name="_Toc242839288"/>
+      <w:bookmarkStart w:id="14" w:name="_Toc242841205"/>
       <w:r>
         <w:rPr>
           <w:color w:val="191B2E"/>
         </w:rPr>
+        <w:lastRenderedPageBreak/>
         <w:t>4. Estrutura do código</w:t>
       </w:r>
       <w:bookmarkEnd w:id="14"/>
@@ -9907,7 +9980,6 @@
           <w:sz w:val="17"/>
           <w:szCs w:val="17"/>
         </w:rPr>
-        <w:lastRenderedPageBreak/>
         <w:t>├── docker-compose.yml          4 serviços (desenvolvimento)</w:t>
       </w:r>
     </w:p>
@@ -10454,8 +10526,8 @@
         <w:tblLook w:val="04A0" w:firstRow="1" w:lastRow="0" w:firstColumn="1" w:lastColumn="0" w:noHBand="0" w:noVBand="1"/>
       </w:tblPr>
       <w:tblGrid>
-        <w:gridCol w:w="3140"/>
-        <w:gridCol w:w="6498"/>
+        <w:gridCol w:w="3550"/>
+        <w:gridCol w:w="6088"/>
       </w:tblGrid>
       <w:tr>
         <w:tblPrEx>
@@ -10469,7 +10541,7 @@
         </w:trPr>
         <w:tc>
           <w:tcPr>
-            <w:tcW w:w="3140" w:type="dxa"/>
+            <w:tcW w:w="3550" w:type="dxa"/>
             <w:tcBorders>
               <w:top w:val="single" w:sz="4" w:space="0" w:color="D9DAE6"/>
               <w:left w:val="single" w:sz="4" w:space="0" w:color="D9DAE6"/>
@@ -10501,7 +10573,7 @@
         </w:tc>
         <w:tc>
           <w:tcPr>
-            <w:tcW w:w="6498" w:type="dxa"/>
+            <w:tcW w:w="6088" w:type="dxa"/>
             <w:tcBorders>
               <w:top w:val="single" w:sz="4" w:space="0" w:color="D9DAE6"/>
               <w:left w:val="single" w:sz="4" w:space="0" w:color="D9DAE6"/>
@@ -10544,7 +10616,7 @@
         </w:trPr>
         <w:tc>
           <w:tcPr>
-            <w:tcW w:w="3140" w:type="dxa"/>
+            <w:tcW w:w="3550" w:type="dxa"/>
             <w:tcBorders>
               <w:top w:val="single" w:sz="4" w:space="0" w:color="D9DAE6"/>
               <w:left w:val="single" w:sz="4" w:space="0" w:color="D9DAE6"/>
@@ -10573,7 +10645,7 @@
         </w:tc>
         <w:tc>
           <w:tcPr>
-            <w:tcW w:w="6498" w:type="dxa"/>
+            <w:tcW w:w="6088" w:type="dxa"/>
             <w:tcBorders>
               <w:top w:val="single" w:sz="4" w:space="0" w:color="D9DAE6"/>
               <w:left w:val="single" w:sz="4" w:space="0" w:color="D9DAE6"/>
@@ -10667,7 +10739,7 @@
         </w:trPr>
         <w:tc>
           <w:tcPr>
-            <w:tcW w:w="3140" w:type="dxa"/>
+            <w:tcW w:w="3550" w:type="dxa"/>
             <w:tcBorders>
               <w:top w:val="single" w:sz="4" w:space="0" w:color="D9DAE6"/>
               <w:left w:val="single" w:sz="4" w:space="0" w:color="D9DAE6"/>
@@ -10696,7 +10768,7 @@
         </w:tc>
         <w:tc>
           <w:tcPr>
-            <w:tcW w:w="6498" w:type="dxa"/>
+            <w:tcW w:w="6088" w:type="dxa"/>
             <w:tcBorders>
               <w:top w:val="single" w:sz="4" w:space="0" w:color="D9DAE6"/>
               <w:left w:val="single" w:sz="4" w:space="0" w:color="D9DAE6"/>
@@ -10756,36 +10828,36 @@
         </w:trPr>
         <w:tc>
           <w:tcPr>
-            <w:tcW w:w="3140" w:type="dxa"/>
-            <w:tcBorders>
-              <w:top w:val="single" w:sz="4" w:space="0" w:color="D9DAE6"/>
-              <w:left w:val="single" w:sz="4" w:space="0" w:color="D9DAE6"/>
-              <w:bottom w:val="single" w:sz="4" w:space="0" w:color="D9DAE6"/>
-              <w:right w:val="single" w:sz="4" w:space="0" w:color="D9DAE6"/>
-            </w:tcBorders>
-            <w:tcMar>
-              <w:top w:w="60" w:type="dxa"/>
-              <w:left w:w="100" w:type="dxa"/>
-              <w:bottom w:w="60" w:type="dxa"/>
-              <w:right w:w="100" w:type="dxa"/>
-            </w:tcMar>
-          </w:tcPr>
-          <w:p>
-            <w:pPr>
-              <w:spacing w:line="252" w:lineRule="auto"/>
-            </w:pPr>
-            <w:r>
-              <w:rPr>
-                <w:sz w:val="19"/>
-                <w:szCs w:val="19"/>
-              </w:rPr>
-              <w:t>Mudar o algoritmo da grade</w:t>
-            </w:r>
-          </w:p>
-        </w:tc>
-        <w:tc>
-          <w:tcPr>
-            <w:tcW w:w="6498" w:type="dxa"/>
+            <w:tcW w:w="3550" w:type="dxa"/>
+            <w:tcBorders>
+              <w:top w:val="single" w:sz="4" w:space="0" w:color="D9DAE6"/>
+              <w:left w:val="single" w:sz="4" w:space="0" w:color="D9DAE6"/>
+              <w:bottom w:val="single" w:sz="4" w:space="0" w:color="D9DAE6"/>
+              <w:right w:val="single" w:sz="4" w:space="0" w:color="D9DAE6"/>
+            </w:tcBorders>
+            <w:tcMar>
+              <w:top w:w="60" w:type="dxa"/>
+              <w:left w:w="100" w:type="dxa"/>
+              <w:bottom w:w="60" w:type="dxa"/>
+              <w:right w:w="100" w:type="dxa"/>
+            </w:tcMar>
+          </w:tcPr>
+          <w:p>
+            <w:pPr>
+              <w:spacing w:line="252" w:lineRule="auto"/>
+            </w:pPr>
+            <w:r>
+              <w:rPr>
+                <w:sz w:val="19"/>
+                <w:szCs w:val="19"/>
+              </w:rPr>
+              <w:t>Mudar o limite ou o custo das dicas</w:t>
+            </w:r>
+          </w:p>
+        </w:tc>
+        <w:tc>
+          <w:tcPr>
+            <w:tcW w:w="6088" w:type="dxa"/>
             <w:tcBorders>
               <w:top w:val="single" w:sz="4" w:space="0" w:color="D9DAE6"/>
               <w:left w:val="single" w:sz="4" w:space="0" w:color="D9DAE6"/>
@@ -10811,14 +10883,24 @@
                 <w:szCs w:val="17"/>
                 <w:shd w:val="clear" w:color="auto" w:fill="F4F4F8"/>
               </w:rPr>
-              <w:t>backend/src/services/gerador.js</w:t>
-            </w:r>
-            <w:r>
-              <w:rPr>
-                <w:sz w:val="19"/>
-                <w:szCs w:val="19"/>
-              </w:rPr>
-              <w:t xml:space="preserve"> (e os testes)</w:t>
+              <w:t>backend/src/regras.js</w:t>
+            </w:r>
+            <w:r>
+              <w:rPr>
+                <w:sz w:val="19"/>
+                <w:szCs w:val="19"/>
+              </w:rPr>
+              <w:t xml:space="preserve"> → </w:t>
+            </w:r>
+            <w:r>
+              <w:rPr>
+                <w:rFonts w:ascii="Consolas" w:eastAsia="Consolas" w:hAnsi="Consolas" w:cs="Consolas"/>
+                <w:color w:val="3730A3"/>
+                <w:sz w:val="17"/>
+                <w:szCs w:val="17"/>
+                <w:shd w:val="clear" w:color="auto" w:fill="F4F4F8"/>
+              </w:rPr>
+              <w:t>DICAS</w:t>
             </w:r>
           </w:p>
         </w:tc>
@@ -10835,36 +10917,36 @@
         </w:trPr>
         <w:tc>
           <w:tcPr>
-            <w:tcW w:w="3140" w:type="dxa"/>
-            <w:tcBorders>
-              <w:top w:val="single" w:sz="4" w:space="0" w:color="D9DAE6"/>
-              <w:left w:val="single" w:sz="4" w:space="0" w:color="D9DAE6"/>
-              <w:bottom w:val="single" w:sz="4" w:space="0" w:color="D9DAE6"/>
-              <w:right w:val="single" w:sz="4" w:space="0" w:color="D9DAE6"/>
-            </w:tcBorders>
-            <w:tcMar>
-              <w:top w:w="60" w:type="dxa"/>
-              <w:left w:w="100" w:type="dxa"/>
-              <w:bottom w:w="60" w:type="dxa"/>
-              <w:right w:w="100" w:type="dxa"/>
-            </w:tcMar>
-          </w:tcPr>
-          <w:p>
-            <w:pPr>
-              <w:spacing w:line="252" w:lineRule="auto"/>
-            </w:pPr>
-            <w:r>
-              <w:rPr>
-                <w:sz w:val="19"/>
-                <w:szCs w:val="19"/>
-              </w:rPr>
-              <w:t>Nova rota da API</w:t>
-            </w:r>
-          </w:p>
-        </w:tc>
-        <w:tc>
-          <w:tcPr>
-            <w:tcW w:w="6498" w:type="dxa"/>
+            <w:tcW w:w="3550" w:type="dxa"/>
+            <w:tcBorders>
+              <w:top w:val="single" w:sz="4" w:space="0" w:color="D9DAE6"/>
+              <w:left w:val="single" w:sz="4" w:space="0" w:color="D9DAE6"/>
+              <w:bottom w:val="single" w:sz="4" w:space="0" w:color="D9DAE6"/>
+              <w:right w:val="single" w:sz="4" w:space="0" w:color="D9DAE6"/>
+            </w:tcBorders>
+            <w:tcMar>
+              <w:top w:w="60" w:type="dxa"/>
+              <w:left w:w="100" w:type="dxa"/>
+              <w:bottom w:w="60" w:type="dxa"/>
+              <w:right w:w="100" w:type="dxa"/>
+            </w:tcMar>
+          </w:tcPr>
+          <w:p>
+            <w:pPr>
+              <w:spacing w:line="252" w:lineRule="auto"/>
+            </w:pPr>
+            <w:r>
+              <w:rPr>
+                <w:sz w:val="19"/>
+                <w:szCs w:val="19"/>
+              </w:rPr>
+              <w:t>Mudar o algoritmo da grade</w:t>
+            </w:r>
+          </w:p>
+        </w:tc>
+        <w:tc>
+          <w:tcPr>
+            <w:tcW w:w="6088" w:type="dxa"/>
             <w:tcBorders>
               <w:top w:val="single" w:sz="4" w:space="0" w:color="D9DAE6"/>
               <w:left w:val="single" w:sz="4" w:space="0" w:color="D9DAE6"/>
@@ -10890,24 +10972,14 @@
                 <w:szCs w:val="17"/>
                 <w:shd w:val="clear" w:color="auto" w:fill="F4F4F8"/>
               </w:rPr>
-              <w:t>backend/src/routes/*.js</w:t>
-            </w:r>
-            <w:r>
-              <w:rPr>
-                <w:sz w:val="19"/>
-                <w:szCs w:val="19"/>
-              </w:rPr>
-              <w:t xml:space="preserve"> + service em </w:t>
-            </w:r>
-            <w:r>
-              <w:rPr>
-                <w:rFonts w:ascii="Consolas" w:eastAsia="Consolas" w:hAnsi="Consolas" w:cs="Consolas"/>
-                <w:color w:val="3730A3"/>
-                <w:sz w:val="17"/>
-                <w:szCs w:val="17"/>
-                <w:shd w:val="clear" w:color="auto" w:fill="F4F4F8"/>
-              </w:rPr>
-              <w:t>backend/src/services/</w:t>
+              <w:t>backend/src/services/gerador.js</w:t>
+            </w:r>
+            <w:r>
+              <w:rPr>
+                <w:sz w:val="19"/>
+                <w:szCs w:val="19"/>
+              </w:rPr>
+              <w:t xml:space="preserve"> (e os testes)</w:t>
             </w:r>
           </w:p>
         </w:tc>
@@ -10924,36 +10996,36 @@
         </w:trPr>
         <w:tc>
           <w:tcPr>
-            <w:tcW w:w="3140" w:type="dxa"/>
-            <w:tcBorders>
-              <w:top w:val="single" w:sz="4" w:space="0" w:color="D9DAE6"/>
-              <w:left w:val="single" w:sz="4" w:space="0" w:color="D9DAE6"/>
-              <w:bottom w:val="single" w:sz="4" w:space="0" w:color="D9DAE6"/>
-              <w:right w:val="single" w:sz="4" w:space="0" w:color="D9DAE6"/>
-            </w:tcBorders>
-            <w:tcMar>
-              <w:top w:w="60" w:type="dxa"/>
-              <w:left w:w="100" w:type="dxa"/>
-              <w:bottom w:w="60" w:type="dxa"/>
-              <w:right w:w="100" w:type="dxa"/>
-            </w:tcMar>
-          </w:tcPr>
-          <w:p>
-            <w:pPr>
-              <w:spacing w:line="252" w:lineRule="auto"/>
-            </w:pPr>
-            <w:r>
-              <w:rPr>
-                <w:sz w:val="19"/>
-                <w:szCs w:val="19"/>
-              </w:rPr>
-              <w:t>Nova tabela ou coluna</w:t>
-            </w:r>
-          </w:p>
-        </w:tc>
-        <w:tc>
-          <w:tcPr>
-            <w:tcW w:w="6498" w:type="dxa"/>
+            <w:tcW w:w="3550" w:type="dxa"/>
+            <w:tcBorders>
+              <w:top w:val="single" w:sz="4" w:space="0" w:color="D9DAE6"/>
+              <w:left w:val="single" w:sz="4" w:space="0" w:color="D9DAE6"/>
+              <w:bottom w:val="single" w:sz="4" w:space="0" w:color="D9DAE6"/>
+              <w:right w:val="single" w:sz="4" w:space="0" w:color="D9DAE6"/>
+            </w:tcBorders>
+            <w:tcMar>
+              <w:top w:w="60" w:type="dxa"/>
+              <w:left w:w="100" w:type="dxa"/>
+              <w:bottom w:w="60" w:type="dxa"/>
+              <w:right w:w="100" w:type="dxa"/>
+            </w:tcMar>
+          </w:tcPr>
+          <w:p>
+            <w:pPr>
+              <w:spacing w:line="252" w:lineRule="auto"/>
+            </w:pPr>
+            <w:r>
+              <w:rPr>
+                <w:sz w:val="19"/>
+                <w:szCs w:val="19"/>
+              </w:rPr>
+              <w:t>Nova rota da API</w:t>
+            </w:r>
+          </w:p>
+        </w:tc>
+        <w:tc>
+          <w:tcPr>
+            <w:tcW w:w="6088" w:type="dxa"/>
             <w:tcBorders>
               <w:top w:val="single" w:sz="4" w:space="0" w:color="D9DAE6"/>
               <w:left w:val="single" w:sz="4" w:space="0" w:color="D9DAE6"/>
@@ -10979,14 +11051,14 @@
                 <w:szCs w:val="17"/>
                 <w:shd w:val="clear" w:color="auto" w:fill="F4F4F8"/>
               </w:rPr>
-              <w:t>backend/db/postgres/schema.sql</w:t>
-            </w:r>
-            <w:r>
-              <w:rPr>
-                <w:sz w:val="19"/>
-                <w:szCs w:val="19"/>
-              </w:rPr>
-              <w:t xml:space="preserve"> + </w:t>
+              <w:t>backend/src/routes/*.js</w:t>
+            </w:r>
+            <w:r>
+              <w:rPr>
+                <w:sz w:val="19"/>
+                <w:szCs w:val="19"/>
+              </w:rPr>
+              <w:t xml:space="preserve"> + service em </w:t>
             </w:r>
             <w:r>
               <w:rPr>
@@ -10996,7 +11068,7 @@
                 <w:szCs w:val="17"/>
                 <w:shd w:val="clear" w:color="auto" w:fill="F4F4F8"/>
               </w:rPr>
-              <w:t>docker compose down -v</w:t>
+              <w:t>backend/src/services/</w:t>
             </w:r>
           </w:p>
         </w:tc>
@@ -11013,36 +11085,36 @@
         </w:trPr>
         <w:tc>
           <w:tcPr>
-            <w:tcW w:w="3140" w:type="dxa"/>
-            <w:tcBorders>
-              <w:top w:val="single" w:sz="4" w:space="0" w:color="D9DAE6"/>
-              <w:left w:val="single" w:sz="4" w:space="0" w:color="D9DAE6"/>
-              <w:bottom w:val="single" w:sz="4" w:space="0" w:color="D9DAE6"/>
-              <w:right w:val="single" w:sz="4" w:space="0" w:color="D9DAE6"/>
-            </w:tcBorders>
-            <w:tcMar>
-              <w:top w:w="60" w:type="dxa"/>
-              <w:left w:w="100" w:type="dxa"/>
-              <w:bottom w:w="60" w:type="dxa"/>
-              <w:right w:w="100" w:type="dxa"/>
-            </w:tcMar>
-          </w:tcPr>
-          <w:p>
-            <w:pPr>
-              <w:spacing w:line="252" w:lineRule="auto"/>
-            </w:pPr>
-            <w:r>
-              <w:rPr>
-                <w:sz w:val="19"/>
-                <w:szCs w:val="19"/>
-              </w:rPr>
-              <w:t>Nova tela</w:t>
-            </w:r>
-          </w:p>
-        </w:tc>
-        <w:tc>
-          <w:tcPr>
-            <w:tcW w:w="6498" w:type="dxa"/>
+            <w:tcW w:w="3550" w:type="dxa"/>
+            <w:tcBorders>
+              <w:top w:val="single" w:sz="4" w:space="0" w:color="D9DAE6"/>
+              <w:left w:val="single" w:sz="4" w:space="0" w:color="D9DAE6"/>
+              <w:bottom w:val="single" w:sz="4" w:space="0" w:color="D9DAE6"/>
+              <w:right w:val="single" w:sz="4" w:space="0" w:color="D9DAE6"/>
+            </w:tcBorders>
+            <w:tcMar>
+              <w:top w:w="60" w:type="dxa"/>
+              <w:left w:w="100" w:type="dxa"/>
+              <w:bottom w:w="60" w:type="dxa"/>
+              <w:right w:w="100" w:type="dxa"/>
+            </w:tcMar>
+          </w:tcPr>
+          <w:p>
+            <w:pPr>
+              <w:spacing w:line="252" w:lineRule="auto"/>
+            </w:pPr>
+            <w:r>
+              <w:rPr>
+                <w:sz w:val="19"/>
+                <w:szCs w:val="19"/>
+              </w:rPr>
+              <w:t>Nova tabela ou coluna</w:t>
+            </w:r>
+          </w:p>
+        </w:tc>
+        <w:tc>
+          <w:tcPr>
+            <w:tcW w:w="6088" w:type="dxa"/>
             <w:tcBorders>
               <w:top w:val="single" w:sz="4" w:space="0" w:color="D9DAE6"/>
               <w:left w:val="single" w:sz="4" w:space="0" w:color="D9DAE6"/>
@@ -11068,14 +11140,14 @@
                 <w:szCs w:val="17"/>
                 <w:shd w:val="clear" w:color="auto" w:fill="F4F4F8"/>
               </w:rPr>
-              <w:t>frontend/src/paginas/</w:t>
-            </w:r>
-            <w:r>
-              <w:rPr>
-                <w:sz w:val="19"/>
-                <w:szCs w:val="19"/>
-              </w:rPr>
-              <w:t xml:space="preserve"> + rota em </w:t>
+              <w:t>backend/db/postgres/schema.sql</w:t>
+            </w:r>
+            <w:r>
+              <w:rPr>
+                <w:sz w:val="19"/>
+                <w:szCs w:val="19"/>
+              </w:rPr>
+              <w:t xml:space="preserve"> + </w:t>
             </w:r>
             <w:r>
               <w:rPr>
@@ -11085,31 +11157,7 @@
                 <w:szCs w:val="17"/>
                 <w:shd w:val="clear" w:color="auto" w:fill="F4F4F8"/>
               </w:rPr>
-              <w:t>frontend/src/main.jsx</w:t>
-            </w:r>
-            <w:r>
-              <w:rPr>
-                <w:sz w:val="19"/>
-                <w:szCs w:val="19"/>
-              </w:rPr>
-              <w:t xml:space="preserve"> (+ menu em </w:t>
-            </w:r>
-            <w:r>
-              <w:rPr>
-                <w:rFonts w:ascii="Consolas" w:eastAsia="Consolas" w:hAnsi="Consolas" w:cs="Consolas"/>
-                <w:color w:val="3730A3"/>
-                <w:sz w:val="17"/>
-                <w:szCs w:val="17"/>
-                <w:shd w:val="clear" w:color="auto" w:fill="F4F4F8"/>
-              </w:rPr>
-              <w:t>componentes/Layout.jsx</w:t>
-            </w:r>
-            <w:r>
-              <w:rPr>
-                <w:sz w:val="19"/>
-                <w:szCs w:val="19"/>
-              </w:rPr>
-              <w:t>)</w:t>
+              <w:t>docker compose down -v</w:t>
             </w:r>
           </w:p>
         </w:tc>
@@ -11126,36 +11174,36 @@
         </w:trPr>
         <w:tc>
           <w:tcPr>
-            <w:tcW w:w="3140" w:type="dxa"/>
-            <w:tcBorders>
-              <w:top w:val="single" w:sz="4" w:space="0" w:color="D9DAE6"/>
-              <w:left w:val="single" w:sz="4" w:space="0" w:color="D9DAE6"/>
-              <w:bottom w:val="single" w:sz="4" w:space="0" w:color="D9DAE6"/>
-              <w:right w:val="single" w:sz="4" w:space="0" w:color="D9DAE6"/>
-            </w:tcBorders>
-            <w:tcMar>
-              <w:top w:w="60" w:type="dxa"/>
-              <w:left w:w="100" w:type="dxa"/>
-              <w:bottom w:w="60" w:type="dxa"/>
-              <w:right w:w="100" w:type="dxa"/>
-            </w:tcMar>
-          </w:tcPr>
-          <w:p>
-            <w:pPr>
-              <w:spacing w:line="252" w:lineRule="auto"/>
-            </w:pPr>
-            <w:r>
-              <w:rPr>
-                <w:sz w:val="19"/>
-                <w:szCs w:val="19"/>
-              </w:rPr>
-              <w:t>Integrar o login com o Lúdica</w:t>
-            </w:r>
-          </w:p>
-        </w:tc>
-        <w:tc>
-          <w:tcPr>
-            <w:tcW w:w="6498" w:type="dxa"/>
+            <w:tcW w:w="3550" w:type="dxa"/>
+            <w:tcBorders>
+              <w:top w:val="single" w:sz="4" w:space="0" w:color="D9DAE6"/>
+              <w:left w:val="single" w:sz="4" w:space="0" w:color="D9DAE6"/>
+              <w:bottom w:val="single" w:sz="4" w:space="0" w:color="D9DAE6"/>
+              <w:right w:val="single" w:sz="4" w:space="0" w:color="D9DAE6"/>
+            </w:tcBorders>
+            <w:tcMar>
+              <w:top w:w="60" w:type="dxa"/>
+              <w:left w:w="100" w:type="dxa"/>
+              <w:bottom w:w="60" w:type="dxa"/>
+              <w:right w:w="100" w:type="dxa"/>
+            </w:tcMar>
+          </w:tcPr>
+          <w:p>
+            <w:pPr>
+              <w:spacing w:line="252" w:lineRule="auto"/>
+            </w:pPr>
+            <w:r>
+              <w:rPr>
+                <w:sz w:val="19"/>
+                <w:szCs w:val="19"/>
+              </w:rPr>
+              <w:t>Nova tela</w:t>
+            </w:r>
+          </w:p>
+        </w:tc>
+        <w:tc>
+          <w:tcPr>
+            <w:tcW w:w="6088" w:type="dxa"/>
             <w:tcBorders>
               <w:top w:val="single" w:sz="4" w:space="0" w:color="D9DAE6"/>
               <w:left w:val="single" w:sz="4" w:space="0" w:color="D9DAE6"/>
@@ -11181,14 +11229,14 @@
                 <w:szCs w:val="17"/>
                 <w:shd w:val="clear" w:color="auto" w:fill="F4F4F8"/>
               </w:rPr>
-              <w:t>backend/src/middleware/auth.js</w:t>
-            </w:r>
-            <w:r>
-              <w:rPr>
-                <w:sz w:val="19"/>
-                <w:szCs w:val="19"/>
-              </w:rPr>
-              <w:t xml:space="preserve"> (</w:t>
+              <w:t>frontend/src/paginas/</w:t>
+            </w:r>
+            <w:r>
+              <w:rPr>
+                <w:sz w:val="19"/>
+                <w:szCs w:val="19"/>
+              </w:rPr>
+              <w:t xml:space="preserve"> + rota em </w:t>
             </w:r>
             <w:r>
               <w:rPr>
@@ -11198,6 +11246,119 @@
                 <w:szCs w:val="17"/>
                 <w:shd w:val="clear" w:color="auto" w:fill="F4F4F8"/>
               </w:rPr>
+              <w:t>frontend/src/main.jsx</w:t>
+            </w:r>
+            <w:r>
+              <w:rPr>
+                <w:sz w:val="19"/>
+                <w:szCs w:val="19"/>
+              </w:rPr>
+              <w:t xml:space="preserve"> (+ menu em </w:t>
+            </w:r>
+            <w:r>
+              <w:rPr>
+                <w:rFonts w:ascii="Consolas" w:eastAsia="Consolas" w:hAnsi="Consolas" w:cs="Consolas"/>
+                <w:color w:val="3730A3"/>
+                <w:sz w:val="17"/>
+                <w:szCs w:val="17"/>
+                <w:shd w:val="clear" w:color="auto" w:fill="F4F4F8"/>
+              </w:rPr>
+              <w:t>componentes/Layout.jsx</w:t>
+            </w:r>
+            <w:r>
+              <w:rPr>
+                <w:sz w:val="19"/>
+                <w:szCs w:val="19"/>
+              </w:rPr>
+              <w:t>)</w:t>
+            </w:r>
+          </w:p>
+        </w:tc>
+      </w:tr>
+      <w:tr>
+        <w:tblPrEx>
+          <w:tblCellMar>
+            <w:top w:w="0" w:type="dxa"/>
+            <w:bottom w:w="0" w:type="dxa"/>
+          </w:tblCellMar>
+        </w:tblPrEx>
+        <w:trPr>
+          <w:cantSplit/>
+        </w:trPr>
+        <w:tc>
+          <w:tcPr>
+            <w:tcW w:w="3550" w:type="dxa"/>
+            <w:tcBorders>
+              <w:top w:val="single" w:sz="4" w:space="0" w:color="D9DAE6"/>
+              <w:left w:val="single" w:sz="4" w:space="0" w:color="D9DAE6"/>
+              <w:bottom w:val="single" w:sz="4" w:space="0" w:color="D9DAE6"/>
+              <w:right w:val="single" w:sz="4" w:space="0" w:color="D9DAE6"/>
+            </w:tcBorders>
+            <w:tcMar>
+              <w:top w:w="60" w:type="dxa"/>
+              <w:left w:w="100" w:type="dxa"/>
+              <w:bottom w:w="60" w:type="dxa"/>
+              <w:right w:w="100" w:type="dxa"/>
+            </w:tcMar>
+          </w:tcPr>
+          <w:p>
+            <w:pPr>
+              <w:spacing w:line="252" w:lineRule="auto"/>
+            </w:pPr>
+            <w:r>
+              <w:rPr>
+                <w:sz w:val="19"/>
+                <w:szCs w:val="19"/>
+              </w:rPr>
+              <w:t>Integrar o login com o Lúdica</w:t>
+            </w:r>
+          </w:p>
+        </w:tc>
+        <w:tc>
+          <w:tcPr>
+            <w:tcW w:w="6088" w:type="dxa"/>
+            <w:tcBorders>
+              <w:top w:val="single" w:sz="4" w:space="0" w:color="D9DAE6"/>
+              <w:left w:val="single" w:sz="4" w:space="0" w:color="D9DAE6"/>
+              <w:bottom w:val="single" w:sz="4" w:space="0" w:color="D9DAE6"/>
+              <w:right w:val="single" w:sz="4" w:space="0" w:color="D9DAE6"/>
+            </w:tcBorders>
+            <w:tcMar>
+              <w:top w:w="60" w:type="dxa"/>
+              <w:left w:w="100" w:type="dxa"/>
+              <w:bottom w:w="60" w:type="dxa"/>
+              <w:right w:w="100" w:type="dxa"/>
+            </w:tcMar>
+          </w:tcPr>
+          <w:p>
+            <w:pPr>
+              <w:spacing w:line="252" w:lineRule="auto"/>
+            </w:pPr>
+            <w:r>
+              <w:rPr>
+                <w:rFonts w:ascii="Consolas" w:eastAsia="Consolas" w:hAnsi="Consolas" w:cs="Consolas"/>
+                <w:color w:val="3730A3"/>
+                <w:sz w:val="17"/>
+                <w:szCs w:val="17"/>
+                <w:shd w:val="clear" w:color="auto" w:fill="F4F4F8"/>
+              </w:rPr>
+              <w:t>backend/src/middleware/auth.js</w:t>
+            </w:r>
+            <w:r>
+              <w:rPr>
+                <w:sz w:val="19"/>
+                <w:szCs w:val="19"/>
+              </w:rPr>
+              <w:t xml:space="preserve"> (</w:t>
+            </w:r>
+            <w:r>
+              <w:rPr>
+                <w:rFonts w:ascii="Consolas" w:eastAsia="Consolas" w:hAnsi="Consolas" w:cs="Consolas"/>
+                <w:color w:val="3730A3"/>
+                <w:sz w:val="17"/>
+                <w:szCs w:val="17"/>
+                <w:shd w:val="clear" w:color="auto" w:fill="F4F4F8"/>
+              </w:rPr>
               <w:t>carregarUsuario</w:t>
             </w:r>
             <w:r>
@@ -11220,11 +11381,12 @@
       <w:pPr>
         <w:pStyle w:val="Ttulo1"/>
       </w:pPr>
-      <w:bookmarkStart w:id="15" w:name="_Toc242839289"/>
+      <w:bookmarkStart w:id="15" w:name="_Toc242841206"/>
       <w:r>
         <w:rPr>
           <w:color w:val="191B2E"/>
         </w:rPr>
+        <w:lastRenderedPageBreak/>
         <w:t>5. Banco de dados</w:t>
       </w:r>
       <w:bookmarkEnd w:id="15"/>
@@ -11233,7 +11395,7 @@
       <w:pPr>
         <w:pStyle w:val="Ttulo2"/>
       </w:pPr>
-      <w:bookmarkStart w:id="16" w:name="_Toc242839290"/>
+      <w:bookmarkStart w:id="16" w:name="_Toc242841207"/>
       <w:r>
         <w:t>5.1 Por que dois bancos</w:t>
       </w:r>
@@ -11671,7 +11833,7 @@
       <w:pPr>
         <w:pStyle w:val="Ttulo2"/>
       </w:pPr>
-      <w:bookmarkStart w:id="17" w:name="_Toc242839291"/>
+      <w:bookmarkStart w:id="17" w:name="_Toc242841208"/>
       <w:r>
         <w:lastRenderedPageBreak/>
         <w:t>5.2 Modelo lógico — PostgreSQL</w:t>
@@ -11691,7 +11853,7 @@
         <w:t>Visão geral</w:t>
       </w:r>
       <w:r>
-        <w:t xml:space="preserve"> das sete tabelas e dos relacionamentos:</w:t>
+        <w:t xml:space="preserve"> das oito tabelas e dos relacionamentos:</w:t>
       </w:r>
     </w:p>
     <w:p>
@@ -11705,10 +11867,10 @@
           <w:noProof/>
         </w:rPr>
         <w:drawing>
-          <wp:inline distT="0" distB="0" distL="0" distR="0" wp14:anchorId="3419EF01" wp14:editId="61F2CFE7">
+          <wp:inline distT="0" distB="0" distL="0" distR="0" wp14:anchorId="01ABB4E3" wp14:editId="334726A8">
             <wp:extent cx="5248275" cy="7991475"/>
             <wp:effectExtent l="0" t="0" r="0" b="0"/>
-            <wp:docPr id="686729298" name="Imagem 686729298"/>
+            <wp:docPr id="1508165251" name="Imagem 1508165251"/>
             <wp:cNvGraphicFramePr>
               <a:graphicFrameLocks xmlns:a="http://schemas.openxmlformats.org/drawingml/2006/main" noChangeAspect="1"/>
             </wp:cNvGraphicFramePr>
@@ -11788,10 +11950,10 @@
           <w:noProof/>
         </w:rPr>
         <w:drawing>
-          <wp:inline distT="0" distB="0" distL="0" distR="0" wp14:anchorId="3B1EC941" wp14:editId="271B9184">
+          <wp:inline distT="0" distB="0" distL="0" distR="0" wp14:anchorId="4BA2CBBB" wp14:editId="3F6EA777">
             <wp:extent cx="5905500" cy="6953250"/>
             <wp:effectExtent l="0" t="0" r="0" b="0"/>
-            <wp:docPr id="603634149" name="Imagem 603634149"/>
+            <wp:docPr id="211062129" name="Imagem 211062129"/>
             <wp:cNvGraphicFramePr>
               <a:graphicFrameLocks xmlns:a="http://schemas.openxmlformats.org/drawingml/2006/main" noChangeAspect="1"/>
             </wp:cNvGraphicFramePr>
@@ -11857,7 +12019,7 @@
         <w:t>Jogo</w:t>
       </w:r>
       <w:r>
-        <w:t xml:space="preserve"> (partidas e respostas; </w:t>
+        <w:t xml:space="preserve"> (partidas, respostas e dicas; </w:t>
       </w:r>
       <w:r>
         <w:rPr>
@@ -11897,10 +12059,10 @@
           <w:noProof/>
         </w:rPr>
         <w:drawing>
-          <wp:inline distT="0" distB="0" distL="0" distR="0" wp14:anchorId="67AA32B1" wp14:editId="0767A3EB">
-            <wp:extent cx="3609975" cy="6924675"/>
+          <wp:inline distT="0" distB="0" distL="0" distR="0" wp14:anchorId="131B549A" wp14:editId="1A895FA8">
+            <wp:extent cx="5143500" cy="7143750"/>
             <wp:effectExtent l="0" t="0" r="0" b="0"/>
-            <wp:docPr id="1158146877" name="Imagem 1158146877"/>
+            <wp:docPr id="1236756136" name="Imagem 1236756136"/>
             <wp:cNvGraphicFramePr>
               <a:graphicFrameLocks xmlns:a="http://schemas.openxmlformats.org/drawingml/2006/main" noChangeAspect="1"/>
             </wp:cNvGraphicFramePr>
@@ -11923,7 +12085,7 @@
                   <pic:spPr bwMode="auto">
                     <a:xfrm>
                       <a:off x="0" y="0"/>
-                      <a:ext cx="3609975" cy="6924675"/>
+                      <a:ext cx="5143500" cy="7143750"/>
                     </a:xfrm>
                     <a:prstGeom prst="rect">
                       <a:avLst/>
@@ -12920,6 +13082,117 @@
           </w:p>
         </w:tc>
       </w:tr>
+      <w:tr>
+        <w:tblPrEx>
+          <w:tblCellMar>
+            <w:top w:w="0" w:type="dxa"/>
+            <w:bottom w:w="0" w:type="dxa"/>
+          </w:tblCellMar>
+        </w:tblPrEx>
+        <w:trPr>
+          <w:cantSplit/>
+        </w:trPr>
+        <w:tc>
+          <w:tcPr>
+            <w:tcW w:w="1723" w:type="dxa"/>
+            <w:tcBorders>
+              <w:top w:val="single" w:sz="4" w:space="0" w:color="D9DAE6"/>
+              <w:left w:val="single" w:sz="4" w:space="0" w:color="D9DAE6"/>
+              <w:bottom w:val="single" w:sz="4" w:space="0" w:color="D9DAE6"/>
+              <w:right w:val="single" w:sz="4" w:space="0" w:color="D9DAE6"/>
+            </w:tcBorders>
+            <w:tcMar>
+              <w:top w:w="60" w:type="dxa"/>
+              <w:left w:w="100" w:type="dxa"/>
+              <w:bottom w:w="60" w:type="dxa"/>
+              <w:right w:w="100" w:type="dxa"/>
+            </w:tcMar>
+          </w:tcPr>
+          <w:p>
+            <w:pPr>
+              <w:spacing w:line="252" w:lineRule="auto"/>
+            </w:pPr>
+            <w:r>
+              <w:rPr>
+                <w:rFonts w:ascii="Consolas" w:eastAsia="Consolas" w:hAnsi="Consolas" w:cs="Consolas"/>
+                <w:color w:val="3730A3"/>
+                <w:sz w:val="17"/>
+                <w:szCs w:val="17"/>
+                <w:shd w:val="clear" w:color="auto" w:fill="F4F4F8"/>
+              </w:rPr>
+              <w:t>dica_sessao</w:t>
+            </w:r>
+          </w:p>
+        </w:tc>
+        <w:tc>
+          <w:tcPr>
+            <w:tcW w:w="3604" w:type="dxa"/>
+            <w:tcBorders>
+              <w:top w:val="single" w:sz="4" w:space="0" w:color="D9DAE6"/>
+              <w:left w:val="single" w:sz="4" w:space="0" w:color="D9DAE6"/>
+              <w:bottom w:val="single" w:sz="4" w:space="0" w:color="D9DAE6"/>
+              <w:right w:val="single" w:sz="4" w:space="0" w:color="D9DAE6"/>
+            </w:tcBorders>
+            <w:tcMar>
+              <w:top w:w="60" w:type="dxa"/>
+              <w:left w:w="100" w:type="dxa"/>
+              <w:bottom w:w="60" w:type="dxa"/>
+              <w:right w:w="100" w:type="dxa"/>
+            </w:tcMar>
+          </w:tcPr>
+          <w:p>
+            <w:pPr>
+              <w:spacing w:line="252" w:lineRule="auto"/>
+            </w:pPr>
+            <w:r>
+              <w:rPr>
+                <w:sz w:val="19"/>
+                <w:szCs w:val="19"/>
+              </w:rPr>
+              <w:t>Letras reveladas pela dica (RN20)</w:t>
+            </w:r>
+          </w:p>
+        </w:tc>
+        <w:tc>
+          <w:tcPr>
+            <w:tcW w:w="4311" w:type="dxa"/>
+            <w:tcBorders>
+              <w:top w:val="single" w:sz="4" w:space="0" w:color="D9DAE6"/>
+              <w:left w:val="single" w:sz="4" w:space="0" w:color="D9DAE6"/>
+              <w:bottom w:val="single" w:sz="4" w:space="0" w:color="D9DAE6"/>
+              <w:right w:val="single" w:sz="4" w:space="0" w:color="D9DAE6"/>
+            </w:tcBorders>
+            <w:tcMar>
+              <w:top w:w="60" w:type="dxa"/>
+              <w:left w:w="100" w:type="dxa"/>
+              <w:bottom w:w="60" w:type="dxa"/>
+              <w:right w:w="100" w:type="dxa"/>
+            </w:tcMar>
+          </w:tcPr>
+          <w:p>
+            <w:pPr>
+              <w:spacing w:line="252" w:lineRule="auto"/>
+            </w:pPr>
+            <w:r>
+              <w:rPr>
+                <w:sz w:val="19"/>
+                <w:szCs w:val="19"/>
+              </w:rPr>
+              <w:t xml:space="preserve">Até 3 por partida; </w:t>
+            </w:r>
+            <w:r>
+              <w:rPr>
+                <w:rFonts w:ascii="Consolas" w:eastAsia="Consolas" w:hAnsi="Consolas" w:cs="Consolas"/>
+                <w:color w:val="3730A3"/>
+                <w:sz w:val="17"/>
+                <w:szCs w:val="17"/>
+                <w:shd w:val="clear" w:color="auto" w:fill="F4F4F8"/>
+              </w:rPr>
+              <w:t>UNIQUE (id_sessao, linha, coluna)</w:t>
+            </w:r>
+          </w:p>
+        </w:tc>
+      </w:tr>
     </w:tbl>
     <w:p>
       <w:pPr>
@@ -12930,7 +13203,7 @@
       <w:pPr>
         <w:pStyle w:val="Ttulo2"/>
       </w:pPr>
-      <w:bookmarkStart w:id="18" w:name="_Toc242839292"/>
+      <w:bookmarkStart w:id="18" w:name="_Toc242841209"/>
       <w:r>
         <w:t xml:space="preserve">5.3 MongoDB — coleção </w:t>
       </w:r>
@@ -12957,10 +13230,10 @@
           <w:noProof/>
         </w:rPr>
         <w:drawing>
-          <wp:inline distT="0" distB="0" distL="0" distR="0" wp14:anchorId="2E082C43" wp14:editId="0A96E188">
+          <wp:inline distT="0" distB="0" distL="0" distR="0" wp14:anchorId="23275CFE" wp14:editId="38272F27">
             <wp:extent cx="3314700" cy="5657850"/>
             <wp:effectExtent l="0" t="0" r="0" b="0"/>
-            <wp:docPr id="1802280431" name="Imagem 1802280431"/>
+            <wp:docPr id="307772613" name="Imagem 307772613"/>
             <wp:cNvGraphicFramePr>
               <a:graphicFrameLocks xmlns:a="http://schemas.openxmlformats.org/drawingml/2006/main" noChangeAspect="1"/>
             </wp:cNvGraphicFramePr>
@@ -13051,6 +13324,7 @@
           <w:sz w:val="17"/>
           <w:szCs w:val="17"/>
         </w:rPr>
+        <w:lastRenderedPageBreak/>
         <w:t xml:space="preserve">  "id_versao": 3,</w:t>
       </w:r>
     </w:p>
@@ -13099,7 +13373,6 @@
           <w:sz w:val="17"/>
           <w:szCs w:val="17"/>
         </w:rPr>
-        <w:lastRenderedPageBreak/>
         <w:t xml:space="preserve">  "palavras": [</w:t>
       </w:r>
     </w:p>
@@ -13248,7 +13521,7 @@
       <w:pPr>
         <w:pStyle w:val="Ttulo2"/>
       </w:pPr>
-      <w:bookmarkStart w:id="19" w:name="_Toc242839293"/>
+      <w:bookmarkStart w:id="19" w:name="_Toc242841210"/>
       <w:r>
         <w:t>5.4 Consistência entre os dois bancos</w:t>
       </w:r>
@@ -13274,10 +13547,10 @@
           <w:noProof/>
         </w:rPr>
         <w:drawing>
-          <wp:inline distT="0" distB="0" distL="0" distR="0" wp14:anchorId="5956D40E" wp14:editId="7311F905">
+          <wp:inline distT="0" distB="0" distL="0" distR="0" wp14:anchorId="5248AB75" wp14:editId="48E67B80">
             <wp:extent cx="5905500" cy="4610100"/>
             <wp:effectExtent l="0" t="0" r="0" b="0"/>
-            <wp:docPr id="1899072835" name="Imagem 1899072835"/>
+            <wp:docPr id="230752155" name="Imagem 230752155"/>
             <wp:cNvGraphicFramePr>
               <a:graphicFrameLocks xmlns:a="http://schemas.openxmlformats.org/drawingml/2006/main" noChangeAspect="1"/>
             </wp:cNvGraphicFramePr>
@@ -13387,7 +13660,7 @@
       <w:pPr>
         <w:pStyle w:val="Ttulo1"/>
       </w:pPr>
-      <w:bookmarkStart w:id="20" w:name="_Toc242839294"/>
+      <w:bookmarkStart w:id="20" w:name="_Toc242841211"/>
       <w:r>
         <w:rPr>
           <w:color w:val="191B2E"/>
@@ -13477,6 +13750,7 @@
                 <w:sz w:val="19"/>
                 <w:szCs w:val="19"/>
               </w:rPr>
+              <w:lastRenderedPageBreak/>
               <w:t>Grupo</w:t>
             </w:r>
           </w:p>
@@ -13699,7 +13973,6 @@
                 <w:sz w:val="19"/>
                 <w:szCs w:val="19"/>
               </w:rPr>
-              <w:lastRenderedPageBreak/>
               <w:t>Autenticação</w:t>
             </w:r>
           </w:p>
@@ -14172,6 +14445,23 @@
                 <w:shd w:val="clear" w:color="auto" w:fill="F4F4F8"/>
               </w:rPr>
               <w:t>POST /sessoes/:id/conferir</w:t>
+            </w:r>
+            <w:r>
+              <w:rPr>
+                <w:sz w:val="19"/>
+                <w:szCs w:val="19"/>
+              </w:rPr>
+              <w:t xml:space="preserve">, </w:t>
+            </w:r>
+            <w:r>
+              <w:rPr>
+                <w:rFonts w:ascii="Consolas" w:eastAsia="Consolas" w:hAnsi="Consolas" w:cs="Consolas"/>
+                <w:color w:val="3730A3"/>
+                <w:sz w:val="17"/>
+                <w:szCs w:val="17"/>
+                <w:shd w:val="clear" w:color="auto" w:fill="F4F4F8"/>
+              </w:rPr>
+              <w:t>POST /sessoes/:id/dica</w:t>
             </w:r>
             <w:r>
               <w:rPr>
@@ -14945,7 +15235,7 @@
       <w:pPr>
         <w:pStyle w:val="Ttulo1"/>
       </w:pPr>
-      <w:bookmarkStart w:id="21" w:name="_Toc242839295"/>
+      <w:bookmarkStart w:id="21" w:name="_Toc242841212"/>
       <w:r>
         <w:rPr>
           <w:color w:val="191B2E"/>
@@ -14958,7 +15248,7 @@
       <w:pPr>
         <w:pStyle w:val="Ttulo2"/>
       </w:pPr>
-      <w:bookmarkStart w:id="22" w:name="_Toc242839296"/>
+      <w:bookmarkStart w:id="22" w:name="_Toc242841213"/>
       <w:r>
         <w:t>7.1 Geração automática da grade</w:t>
       </w:r>
@@ -15001,7 +15291,7 @@
       <w:pPr>
         <w:pStyle w:val="Ttulo2"/>
       </w:pPr>
-      <w:bookmarkStart w:id="23" w:name="_Toc242839297"/>
+      <w:bookmarkStart w:id="23" w:name="_Toc242841214"/>
       <w:r>
         <w:t>7.2 Partida e pontuação</w:t>
       </w:r>
@@ -15067,7 +15357,7 @@
       <w:pPr>
         <w:pStyle w:val="Ttulo2"/>
       </w:pPr>
-      <w:bookmarkStart w:id="24" w:name="_Toc242839298"/>
+      <w:bookmarkStart w:id="24" w:name="_Toc242841215"/>
       <w:r>
         <w:t>7.3 Autenticação provisória e integração com o Lúdica</w:t>
       </w:r>
@@ -15130,7 +15420,11 @@
         <w:t>backend/src/middleware/auth.js</w:t>
       </w:r>
       <w:r>
-        <w:t xml:space="preserve"> para ler o usuário do token ou cabeçalho que o Lúdica enviar (usando </w:t>
+        <w:t xml:space="preserve"> para ler o usuário do token ou cabeçalho que o </w:t>
+      </w:r>
+      <w:r>
+        <w:lastRenderedPageBreak/>
+        <w:t xml:space="preserve">Lúdica enviar (usando </w:t>
       </w:r>
       <w:r>
         <w:rPr>
@@ -15156,7 +15450,6 @@
         <w:ind w:left="240" w:right="240"/>
       </w:pPr>
       <w:r>
-        <w:lastRenderedPageBreak/>
         <w:t>A sessão fica em memória na API: se o container reiniciar, os usuários precisam entrar de novo.</w:t>
       </w:r>
     </w:p>
@@ -15164,7 +15457,7 @@
       <w:pPr>
         <w:pStyle w:val="Ttulo1"/>
       </w:pPr>
-      <w:bookmarkStart w:id="25" w:name="_Toc242839299"/>
+      <w:bookmarkStart w:id="25" w:name="_Toc242841216"/>
       <w:r>
         <w:rPr>
           <w:color w:val="191B2E"/>
@@ -15177,7 +15470,7 @@
       <w:pPr>
         <w:pStyle w:val="Ttulo2"/>
       </w:pPr>
-      <w:bookmarkStart w:id="26" w:name="_Toc242839300"/>
+      <w:bookmarkStart w:id="26" w:name="_Toc242841217"/>
       <w:r>
         <w:t>8.1 Requisitos do servidor</w:t>
       </w:r>
@@ -15264,7 +15557,7 @@
       <w:pPr>
         <w:pStyle w:val="Ttulo2"/>
       </w:pPr>
-      <w:bookmarkStart w:id="27" w:name="_Toc242839301"/>
+      <w:bookmarkStart w:id="27" w:name="_Toc242841218"/>
       <w:r>
         <w:t>8.2 O que muda em produção</w:t>
       </w:r>
@@ -16267,7 +16560,7 @@
       <w:pPr>
         <w:pStyle w:val="Ttulo2"/>
       </w:pPr>
-      <w:bookmarkStart w:id="28" w:name="_Toc242839302"/>
+      <w:bookmarkStart w:id="28" w:name="_Toc242841219"/>
       <w:r>
         <w:t>8.3 Passo a passo</w:t>
       </w:r>
@@ -16912,6 +17205,7 @@
                 <w:szCs w:val="17"/>
                 <w:shd w:val="clear" w:color="auto" w:fill="F4F4F8"/>
               </w:rPr>
+              <w:lastRenderedPageBreak/>
               <w:t>MONGO_PASSWORD</w:t>
             </w:r>
           </w:p>
@@ -17127,7 +17421,6 @@
                 <w:szCs w:val="17"/>
                 <w:shd w:val="clear" w:color="auto" w:fill="F4F4F8"/>
               </w:rPr>
-              <w:lastRenderedPageBreak/>
               <w:t>WEB_PORT</w:t>
             </w:r>
           </w:p>
@@ -17399,7 +17692,7 @@
       <w:pPr>
         <w:pStyle w:val="Ttulo2"/>
       </w:pPr>
-      <w:bookmarkStart w:id="29" w:name="_Toc242839303"/>
+      <w:bookmarkStart w:id="29" w:name="_Toc242841220"/>
       <w:r>
         <w:t>8.4 Atualizar para uma nova versão</w:t>
       </w:r>
@@ -17490,7 +17783,7 @@
       <w:pPr>
         <w:pStyle w:val="Ttulo2"/>
       </w:pPr>
-      <w:bookmarkStart w:id="30" w:name="_Toc242839304"/>
+      <w:bookmarkStart w:id="30" w:name="_Toc242841221"/>
       <w:r>
         <w:t>8.5 Backup e restauração</w:t>
       </w:r>
@@ -17745,7 +18038,7 @@
       <w:pPr>
         <w:pStyle w:val="Ttulo2"/>
       </w:pPr>
-      <w:bookmarkStart w:id="31" w:name="_Toc242839305"/>
+      <w:bookmarkStart w:id="31" w:name="_Toc242841222"/>
       <w:r>
         <w:t>8.6 Monitoramento e logs</w:t>
       </w:r>
@@ -18155,9 +18448,8 @@
       <w:pPr>
         <w:pStyle w:val="Ttulo2"/>
       </w:pPr>
-      <w:bookmarkStart w:id="32" w:name="_Toc242839306"/>
-      <w:r>
-        <w:lastRenderedPageBreak/>
+      <w:bookmarkStart w:id="32" w:name="_Toc242841223"/>
+      <w:r>
         <w:t>8.7 HTTPS</w:t>
       </w:r>
       <w:bookmarkEnd w:id="32"/>
@@ -18187,7 +18479,7 @@
       <w:pPr>
         <w:pStyle w:val="Ttulo1"/>
       </w:pPr>
-      <w:bookmarkStart w:id="33" w:name="_Toc242839307"/>
+      <w:bookmarkStart w:id="33" w:name="_Toc242841224"/>
       <w:r>
         <w:rPr>
           <w:color w:val="191B2E"/>
@@ -18860,7 +19152,7 @@
       <w:pPr>
         <w:pStyle w:val="Ttulo1"/>
       </w:pPr>
-      <w:bookmarkStart w:id="34" w:name="_Toc242839308"/>
+      <w:bookmarkStart w:id="34" w:name="_Toc242841225"/>
       <w:r>
         <w:rPr>
           <w:color w:val="191B2E"/>
@@ -19552,11 +19844,12 @@
       <w:pPr>
         <w:pStyle w:val="Ttulo1"/>
       </w:pPr>
-      <w:bookmarkStart w:id="35" w:name="_Toc242839309"/>
+      <w:bookmarkStart w:id="35" w:name="_Toc242841226"/>
       <w:r>
         <w:rPr>
           <w:color w:val="191B2E"/>
         </w:rPr>
+        <w:lastRenderedPageBreak/>
         <w:t>11. Referências</w:t>
       </w:r>
       <w:bookmarkEnd w:id="35"/>
@@ -20763,64 +21056,64 @@
 <file path=word/numbering.xml><?xml version="1.0" encoding="utf-8"?>
 <w:numbering xmlns:wpc="http://schemas.microsoft.com/office/word/2010/wordprocessingCanvas" xmlns:cx="http://schemas.microsoft.com/office/drawing/2014/chartex" xmlns:cx1="http://schemas.microsoft.com/office/drawing/2015/9/8/chartex" xmlns:cx2="http://schemas.microsoft.com/office/drawing/2015/10/21/chartex" xmlns:cx3="http://schemas.microsoft.com/office/drawing/2016/5/9/chartex" xmlns:cx4="http://schemas.microsoft.com/office/drawing/2016/5/10/chartex" xmlns:cx5="http://schemas.microsoft.com/office/drawing/2016/5/11/chartex" xmlns:cx6="http://schemas.microsoft.com/office/drawing/2016/5/12/chartex" xmlns:cx7="http://schemas.microsoft.com/office/drawing/2016/5/13/chartex" xmlns:cx8="http://schemas.microsoft.com/office/drawing/2016/5/14/chartex" xmlns:mc="http://schemas.openxmlformats.org/markup-compatibility/2006" xmlns:aink="http://schemas.microsoft.com/office/drawing/2016/ink" xmlns:am3d="http://schemas.microsoft.com/office/drawing/2017/model3d" xmlns:o="urn:schemas-microsoft-com:office:office" xmlns:oel="http://schemas.microsoft.com/office/2019/extlst" xmlns:r="http://schemas.openxmlformats.org/officeDocument/2006/relationships" xmlns:m="http://schemas.openxmlformats.org/officeDocument/2006/math" xmlns:v="urn:schemas-microsoft-com:vml" xmlns:wp14="http://schemas.microsoft.com/office/word/2010/wordprocessingDrawing" xmlns:wp="http://schemas.openxmlformats.org/drawingml/2006/wordprocessingDrawing" xmlns:w10="urn:schemas-microsoft-com:office:word" xmlns:w="http://schemas.openxmlformats.org/wordprocessingml/2006/main" xmlns:w14="http://schemas.microsoft.com/office/word/2010/wordml" xmlns:w15="http://schemas.microsoft.com/office/word/2012/wordml" xmlns:w16cex="http://schemas.microsoft.com/office/word/2018/wordml/cex" xmlns:w16cid="http://schemas.microsoft.com/office/word/2016/wordml/cid" xmlns:w16="http://schemas.microsoft.com/office/word/2018/wordml" xmlns:w16du="http://schemas.microsoft.com/office/word/2023/wordml/word16du" xmlns:w16sdtdh="http://schemas.microsoft.com/office/word/2020/wordml/sdtdatahash" xmlns:w16sdtfl="http://schemas.microsoft.com/office/word/2024/wordml/sdtformatlock" xmlns:w16se="http://schemas.microsoft.com/office/word/2015/wordml/symex" xmlns:wpg="http://schemas.microsoft.com/office/word/2010/wordprocessingGroup" xmlns:wpi="http://schemas.microsoft.com/office/word/2010/wordprocessingInk" xmlns:wne="http://schemas.microsoft.com/office/word/2006/wordml" xmlns:wps="http://schemas.microsoft.com/office/word/2010/wordprocessingShape" mc:Ignorable="w14 w15 w16se w16cid w16 w16cex w16sdtdh w16sdtfl w16du wp14">
   <w:abstractNum w:abstractNumId="0" w15:restartNumberingAfterBreak="0">
-    <w:nsid w:val="13043DCD"/>
+    <w:nsid w:val="200C322A"/>
     <w:multiLevelType w:val="hybridMultilevel"/>
-    <w:tmpl w:val="63B45E16"/>
-    <w:lvl w:ilvl="0" w:tplc="CA8CEB92">
+    <w:tmpl w:val="535C6F9A"/>
+    <w:lvl w:ilvl="0" w:tplc="D6E83334">
       <w:start w:val="1"/>
-      <w:numFmt w:val="decimal"/>
-      <w:lvlText w:val="%1."/>
+      <w:numFmt w:val="bullet"/>
+      <w:lvlText w:val="•"/>
       <w:lvlJc w:val="left"/>
       <w:pPr>
-        <w:ind w:left="540" w:hanging="300"/>
+        <w:ind w:left="540" w:hanging="270"/>
       </w:pPr>
     </w:lvl>
-    <w:lvl w:ilvl="1" w:tplc="CAEA2CD2">
+    <w:lvl w:ilvl="1" w:tplc="D4FA24AE">
       <w:numFmt w:val="decimal"/>
       <w:lvlText w:val=""/>
       <w:lvlJc w:val="left"/>
     </w:lvl>
-    <w:lvl w:ilvl="2" w:tplc="E3E6ABFC">
+    <w:lvl w:ilvl="2" w:tplc="8794A5AC">
       <w:numFmt w:val="decimal"/>
       <w:lvlText w:val=""/>
       <w:lvlJc w:val="left"/>
     </w:lvl>
-    <w:lvl w:ilvl="3" w:tplc="7042FFE2">
+    <w:lvl w:ilvl="3" w:tplc="39F02856">
       <w:numFmt w:val="decimal"/>
       <w:lvlText w:val=""/>
       <w:lvlJc w:val="left"/>
     </w:lvl>
-    <w:lvl w:ilvl="4" w:tplc="1E142E14">
+    <w:lvl w:ilvl="4" w:tplc="E53839AE">
       <w:numFmt w:val="decimal"/>
       <w:lvlText w:val=""/>
       <w:lvlJc w:val="left"/>
     </w:lvl>
-    <w:lvl w:ilvl="5" w:tplc="014C38BE">
+    <w:lvl w:ilvl="5" w:tplc="1FBE1406">
       <w:numFmt w:val="decimal"/>
       <w:lvlText w:val=""/>
       <w:lvlJc w:val="left"/>
     </w:lvl>
-    <w:lvl w:ilvl="6" w:tplc="248C9876">
+    <w:lvl w:ilvl="6" w:tplc="9EE67270">
       <w:numFmt w:val="decimal"/>
       <w:lvlText w:val=""/>
       <w:lvlJc w:val="left"/>
     </w:lvl>
-    <w:lvl w:ilvl="7" w:tplc="94561AE2">
+    <w:lvl w:ilvl="7" w:tplc="AC280C7A">
       <w:numFmt w:val="decimal"/>
       <w:lvlText w:val=""/>
       <w:lvlJc w:val="left"/>
     </w:lvl>
-    <w:lvl w:ilvl="8" w:tplc="A7725C28">
+    <w:lvl w:ilvl="8" w:tplc="F098C1FE">
       <w:numFmt w:val="decimal"/>
       <w:lvlText w:val=""/>
       <w:lvlJc w:val="left"/>
     </w:lvl>
   </w:abstractNum>
   <w:abstractNum w:abstractNumId="1" w15:restartNumberingAfterBreak="0">
-    <w:nsid w:val="146934B7"/>
+    <w:nsid w:val="49B154DE"/>
     <w:multiLevelType w:val="hybridMultilevel"/>
-    <w:tmpl w:val="F9D4DBC4"/>
-    <w:lvl w:ilvl="0" w:tplc="A1E20804">
+    <w:tmpl w:val="FD4C1268"/>
+    <w:lvl w:ilvl="0" w:tplc="7B5E4144">
       <w:start w:val="1"/>
       <w:numFmt w:val="decimal"/>
       <w:lvlText w:val="%1."/>
@@ -20829,52 +21122,52 @@
         <w:ind w:left="540" w:hanging="300"/>
       </w:pPr>
     </w:lvl>
-    <w:lvl w:ilvl="1" w:tplc="BAC0CF60">
+    <w:lvl w:ilvl="1" w:tplc="60CC0A18">
       <w:numFmt w:val="decimal"/>
       <w:lvlText w:val=""/>
       <w:lvlJc w:val="left"/>
     </w:lvl>
-    <w:lvl w:ilvl="2" w:tplc="1EF638A2">
+    <w:lvl w:ilvl="2" w:tplc="7B74A762">
       <w:numFmt w:val="decimal"/>
       <w:lvlText w:val=""/>
       <w:lvlJc w:val="left"/>
     </w:lvl>
-    <w:lvl w:ilvl="3" w:tplc="EB8E3762">
+    <w:lvl w:ilvl="3" w:tplc="F9D4F840">
       <w:numFmt w:val="decimal"/>
       <w:lvlText w:val=""/>
       <w:lvlJc w:val="left"/>
     </w:lvl>
-    <w:lvl w:ilvl="4" w:tplc="120A8696">
+    <w:lvl w:ilvl="4" w:tplc="49A6FC4E">
       <w:numFmt w:val="decimal"/>
       <w:lvlText w:val=""/>
       <w:lvlJc w:val="left"/>
     </w:lvl>
-    <w:lvl w:ilvl="5" w:tplc="C6D0903E">
+    <w:lvl w:ilvl="5" w:tplc="ED987BC4">
       <w:numFmt w:val="decimal"/>
       <w:lvlText w:val=""/>
       <w:lvlJc w:val="left"/>
     </w:lvl>
-    <w:lvl w:ilvl="6" w:tplc="278225AC">
+    <w:lvl w:ilvl="6" w:tplc="AD1C7774">
       <w:numFmt w:val="decimal"/>
       <w:lvlText w:val=""/>
       <w:lvlJc w:val="left"/>
     </w:lvl>
-    <w:lvl w:ilvl="7" w:tplc="A0E86270">
+    <w:lvl w:ilvl="7" w:tplc="2CC266D6">
       <w:numFmt w:val="decimal"/>
       <w:lvlText w:val=""/>
       <w:lvlJc w:val="left"/>
     </w:lvl>
-    <w:lvl w:ilvl="8" w:tplc="F334C2AA">
+    <w:lvl w:ilvl="8" w:tplc="AD20507A">
       <w:numFmt w:val="decimal"/>
       <w:lvlText w:val=""/>
       <w:lvlJc w:val="left"/>
     </w:lvl>
   </w:abstractNum>
   <w:abstractNum w:abstractNumId="2" w15:restartNumberingAfterBreak="0">
-    <w:nsid w:val="1709614E"/>
+    <w:nsid w:val="5BE5246D"/>
     <w:multiLevelType w:val="hybridMultilevel"/>
-    <w:tmpl w:val="83000EC6"/>
-    <w:lvl w:ilvl="0" w:tplc="394A3602">
+    <w:tmpl w:val="71AC33D4"/>
+    <w:lvl w:ilvl="0" w:tplc="A8A8CE06">
       <w:start w:val="1"/>
       <w:numFmt w:val="bullet"/>
       <w:lvlText w:val="●"/>
@@ -20883,7 +21176,7 @@
         <w:ind w:left="720" w:hanging="360"/>
       </w:pPr>
     </w:lvl>
-    <w:lvl w:ilvl="1" w:tplc="7392459A">
+    <w:lvl w:ilvl="1" w:tplc="73086EBE">
       <w:start w:val="1"/>
       <w:numFmt w:val="bullet"/>
       <w:lvlText w:val="○"/>
@@ -20892,7 +21185,7 @@
         <w:ind w:left="1440" w:hanging="360"/>
       </w:pPr>
     </w:lvl>
-    <w:lvl w:ilvl="2" w:tplc="9FA0638C">
+    <w:lvl w:ilvl="2" w:tplc="FF2A8B88">
       <w:start w:val="1"/>
       <w:numFmt w:val="bullet"/>
       <w:lvlText w:val="■"/>
@@ -20901,7 +21194,7 @@
         <w:ind w:left="2160" w:hanging="360"/>
       </w:pPr>
     </w:lvl>
-    <w:lvl w:ilvl="3" w:tplc="5BAEBD2A">
+    <w:lvl w:ilvl="3" w:tplc="7BD64A6E">
       <w:start w:val="1"/>
       <w:numFmt w:val="bullet"/>
       <w:lvlText w:val="●"/>
@@ -20910,7 +21203,7 @@
         <w:ind w:left="2880" w:hanging="360"/>
       </w:pPr>
     </w:lvl>
-    <w:lvl w:ilvl="4" w:tplc="943C2682">
+    <w:lvl w:ilvl="4" w:tplc="ACDCF734">
       <w:start w:val="1"/>
       <w:numFmt w:val="bullet"/>
       <w:lvlText w:val="○"/>
@@ -20919,7 +21212,7 @@
         <w:ind w:left="3600" w:hanging="360"/>
       </w:pPr>
     </w:lvl>
-    <w:lvl w:ilvl="5" w:tplc="B8ECBAC8">
+    <w:lvl w:ilvl="5" w:tplc="0DE209A6">
       <w:start w:val="1"/>
       <w:numFmt w:val="bullet"/>
       <w:lvlText w:val="■"/>
@@ -20928,7 +21221,7 @@
         <w:ind w:left="4320" w:hanging="360"/>
       </w:pPr>
     </w:lvl>
-    <w:lvl w:ilvl="6" w:tplc="2E085664">
+    <w:lvl w:ilvl="6" w:tplc="8B001640">
       <w:start w:val="1"/>
       <w:numFmt w:val="bullet"/>
       <w:lvlText w:val="●"/>
@@ -20937,7 +21230,7 @@
         <w:ind w:left="5040" w:hanging="360"/>
       </w:pPr>
     </w:lvl>
-    <w:lvl w:ilvl="7" w:tplc="CFF8FD46">
+    <w:lvl w:ilvl="7" w:tplc="1B0E49C4">
       <w:start w:val="1"/>
       <w:numFmt w:val="bullet"/>
       <w:lvlText w:val="●"/>
@@ -20946,7 +21239,7 @@
         <w:ind w:left="5760" w:hanging="360"/>
       </w:pPr>
     </w:lvl>
-    <w:lvl w:ilvl="8" w:tplc="F51E1A2A">
+    <w:lvl w:ilvl="8" w:tplc="72C6AD84">
       <w:start w:val="1"/>
       <w:numFmt w:val="bullet"/>
       <w:lvlText w:val="●"/>
@@ -20957,79 +21250,79 @@
     </w:lvl>
   </w:abstractNum>
   <w:abstractNum w:abstractNumId="3" w15:restartNumberingAfterBreak="0">
-    <w:nsid w:val="63CE30B0"/>
+    <w:nsid w:val="5E1515EA"/>
     <w:multiLevelType w:val="hybridMultilevel"/>
-    <w:tmpl w:val="3412018C"/>
-    <w:lvl w:ilvl="0" w:tplc="B70240E4">
+    <w:tmpl w:val="CA7C99A6"/>
+    <w:lvl w:ilvl="0" w:tplc="0DFE0AAA">
       <w:start w:val="1"/>
-      <w:numFmt w:val="bullet"/>
-      <w:lvlText w:val="•"/>
+      <w:numFmt w:val="decimal"/>
+      <w:lvlText w:val="%1."/>
       <w:lvlJc w:val="left"/>
       <w:pPr>
-        <w:ind w:left="540" w:hanging="270"/>
+        <w:ind w:left="540" w:hanging="300"/>
       </w:pPr>
     </w:lvl>
-    <w:lvl w:ilvl="1" w:tplc="C55AA52E">
+    <w:lvl w:ilvl="1" w:tplc="7A0EDC48">
       <w:numFmt w:val="decimal"/>
       <w:lvlText w:val=""/>
       <w:lvlJc w:val="left"/>
     </w:lvl>
-    <w:lvl w:ilvl="2" w:tplc="6868BA1A">
+    <w:lvl w:ilvl="2" w:tplc="4F085C3E">
       <w:numFmt w:val="decimal"/>
       <w:lvlText w:val=""/>
       <w:lvlJc w:val="left"/>
     </w:lvl>
-    <w:lvl w:ilvl="3" w:tplc="17883848">
+    <w:lvl w:ilvl="3" w:tplc="0C08D9EE">
       <w:numFmt w:val="decimal"/>
       <w:lvlText w:val=""/>
       <w:lvlJc w:val="left"/>
     </w:lvl>
-    <w:lvl w:ilvl="4" w:tplc="AA04D752">
+    <w:lvl w:ilvl="4" w:tplc="3D0A0CBE">
       <w:numFmt w:val="decimal"/>
       <w:lvlText w:val=""/>
       <w:lvlJc w:val="left"/>
     </w:lvl>
-    <w:lvl w:ilvl="5" w:tplc="F160881A">
+    <w:lvl w:ilvl="5" w:tplc="55643E10">
       <w:numFmt w:val="decimal"/>
       <w:lvlText w:val=""/>
       <w:lvlJc w:val="left"/>
     </w:lvl>
-    <w:lvl w:ilvl="6" w:tplc="D134305A">
+    <w:lvl w:ilvl="6" w:tplc="6C1E38E4">
       <w:numFmt w:val="decimal"/>
       <w:lvlText w:val=""/>
       <w:lvlJc w:val="left"/>
     </w:lvl>
-    <w:lvl w:ilvl="7" w:tplc="5A8AB35C">
+    <w:lvl w:ilvl="7" w:tplc="FB72C7D0">
       <w:numFmt w:val="decimal"/>
       <w:lvlText w:val=""/>
       <w:lvlJc w:val="left"/>
     </w:lvl>
-    <w:lvl w:ilvl="8" w:tplc="3E9A2D50">
+    <w:lvl w:ilvl="8" w:tplc="EFC61D0A">
       <w:numFmt w:val="decimal"/>
       <w:lvlText w:val=""/>
       <w:lvlJc w:val="left"/>
     </w:lvl>
   </w:abstractNum>
-  <w:num w:numId="1" w16cid:durableId="827864896">
+  <w:num w:numId="1" w16cid:durableId="3092112">
     <w:abstractNumId w:val="2"/>
     <w:lvlOverride w:ilvl="0">
       <w:startOverride w:val="1"/>
     </w:lvlOverride>
   </w:num>
-  <w:num w:numId="2" w16cid:durableId="1456680732">
-    <w:abstractNumId w:val="3"/>
+  <w:num w:numId="2" w16cid:durableId="570774378">
+    <w:abstractNumId w:val="0"/>
     <w:lvlOverride w:ilvl="0">
       <w:startOverride w:val="1"/>
     </w:lvlOverride>
   </w:num>
-  <w:num w:numId="3" w16cid:durableId="1845120205">
+  <w:num w:numId="3" w16cid:durableId="1369183734">
     <w:abstractNumId w:val="1"/>
     <w:lvlOverride w:ilvl="0">
       <w:startOverride w:val="1"/>
     </w:lvlOverride>
   </w:num>
-  <w:num w:numId="4" w16cid:durableId="29377133">
-    <w:abstractNumId w:val="0"/>
+  <w:num w:numId="4" w16cid:durableId="392705672">
+    <w:abstractNumId w:val="3"/>
     <w:lvlOverride w:ilvl="0">
       <w:startOverride w:val="1"/>
     </w:lvlOverride>
@@ -21622,7 +21915,7 @@
     <w:autoRedefine/>
     <w:uiPriority w:val="39"/>
     <w:unhideWhenUsed/>
-    <w:rsid w:val="00371E24"/>
+    <w:rsid w:val="000754D8"/>
     <w:pPr>
       <w:spacing w:after="100"/>
     </w:pPr>
@@ -21634,7 +21927,7 @@
     <w:autoRedefine/>
     <w:uiPriority w:val="39"/>
     <w:unhideWhenUsed/>
-    <w:rsid w:val="00371E24"/>
+    <w:rsid w:val="000754D8"/>
     <w:pPr>
       <w:spacing w:after="100"/>
       <w:ind w:left="220"/>

</xml_diff>